<commit_message>
Update project report with new screenshots showing the sample photographs
Co-Authored-By: Claude Opus 5.5 <noreply@anthropic.com>
</commit_message>
<xml_diff>
--- a/docs/Tourism_Management_System_Project_Report.docx
+++ b/docs/Tourism_Management_System_Project_Report.docx
@@ -148,7 +148,7 @@
         <w:pageBreakBefore/>
         <w:jc w:val="center"/>
       </w:pPr>
-      <w:bookmarkStart w:id="1" w:name="_Toc242719231"/>
+      <w:bookmarkStart w:id="1" w:name="_Toc242721337"/>
       <w:r>
         <w:lastRenderedPageBreak/>
         <w:t>DECLARATION</w:t>
@@ -201,7 +201,7 @@
         <w:pageBreakBefore/>
         <w:jc w:val="center"/>
       </w:pPr>
-      <w:bookmarkStart w:id="2" w:name="_Toc242719232"/>
+      <w:bookmarkStart w:id="2" w:name="_Toc242721338"/>
       <w:r>
         <w:lastRenderedPageBreak/>
         <w:t>APPROVAL</w:t>
@@ -304,7 +304,7 @@
         <w:pageBreakBefore/>
         <w:jc w:val="center"/>
       </w:pPr>
-      <w:bookmarkStart w:id="3" w:name="_Toc242719233"/>
+      <w:bookmarkStart w:id="3" w:name="_Toc242721339"/>
       <w:r>
         <w:lastRenderedPageBreak/>
         <w:t>DEDICATION</w:t>
@@ -325,7 +325,7 @@
         <w:pageBreakBefore/>
         <w:jc w:val="center"/>
       </w:pPr>
-      <w:bookmarkStart w:id="4" w:name="_Toc242719234"/>
+      <w:bookmarkStart w:id="4" w:name="_Toc242721340"/>
       <w:r>
         <w:lastRenderedPageBreak/>
         <w:t>ACKNOWLEDGEMENTS</w:t>
@@ -349,7 +349,7 @@
         <w:pageBreakBefore/>
         <w:jc w:val="center"/>
       </w:pPr>
-      <w:bookmarkStart w:id="5" w:name="_Toc242719235"/>
+      <w:bookmarkStart w:id="5" w:name="_Toc242721341"/>
       <w:r>
         <w:lastRenderedPageBreak/>
         <w:t>ABSTRACT</w:t>
@@ -420,7 +420,7 @@
     <w:sdt>
       <w:sdtPr>
         <w:alias w:val="Table of Contents"/>
-        <w:id w:val="-263453910"/>
+        <w:id w:val="2106374044"/>
       </w:sdtPr>
       <w:sdtEndPr/>
       <w:sdtContent>
@@ -443,7 +443,7 @@
           <w:r>
             <w:fldChar w:fldCharType="separate"/>
           </w:r>
-          <w:hyperlink w:anchor="_Toc242719231" w:history="1">
+          <w:hyperlink w:anchor="_Toc242721337" w:history="1">
             <w:r>
               <w:rPr>
                 <w:rStyle w:val="Hyperlink"/>
@@ -467,7 +467,7 @@
               <w:rPr>
                 <w:noProof/>
               </w:rPr>
-              <w:instrText xml:space="preserve"> PAGEREF _Toc242719231 \h </w:instrText>
+              <w:instrText xml:space="preserve"> PAGEREF _Toc242721337 \h </w:instrText>
             </w:r>
             <w:r>
               <w:rPr>
@@ -504,7 +504,7 @@
               <w:noProof/>
             </w:rPr>
           </w:pPr>
-          <w:hyperlink w:anchor="_Toc242719232" w:history="1">
+          <w:hyperlink w:anchor="_Toc242721338" w:history="1">
             <w:r>
               <w:rPr>
                 <w:rStyle w:val="Hyperlink"/>
@@ -528,7 +528,7 @@
               <w:rPr>
                 <w:noProof/>
               </w:rPr>
-              <w:instrText xml:space="preserve"> PAGEREF _Toc242719232 \h </w:instrText>
+              <w:instrText xml:space="preserve"> PAGEREF _Toc242721338 \h </w:instrText>
             </w:r>
             <w:r>
               <w:rPr>
@@ -565,7 +565,7 @@
               <w:noProof/>
             </w:rPr>
           </w:pPr>
-          <w:hyperlink w:anchor="_Toc242719233" w:history="1">
+          <w:hyperlink w:anchor="_Toc242721339" w:history="1">
             <w:r>
               <w:rPr>
                 <w:rStyle w:val="Hyperlink"/>
@@ -589,7 +589,7 @@
               <w:rPr>
                 <w:noProof/>
               </w:rPr>
-              <w:instrText xml:space="preserve"> PAGEREF _Toc242719233 \h </w:instrText>
+              <w:instrText xml:space="preserve"> PAGEREF _Toc242721339 \h </w:instrText>
             </w:r>
             <w:r>
               <w:rPr>
@@ -626,7 +626,7 @@
               <w:noProof/>
             </w:rPr>
           </w:pPr>
-          <w:hyperlink w:anchor="_Toc242719234" w:history="1">
+          <w:hyperlink w:anchor="_Toc242721340" w:history="1">
             <w:r>
               <w:rPr>
                 <w:rStyle w:val="Hyperlink"/>
@@ -650,7 +650,7 @@
               <w:rPr>
                 <w:noProof/>
               </w:rPr>
-              <w:instrText xml:space="preserve"> PAGEREF _Toc242719234 \h </w:instrText>
+              <w:instrText xml:space="preserve"> PAGEREF _Toc242721340 \h </w:instrText>
             </w:r>
             <w:r>
               <w:rPr>
@@ -687,7 +687,7 @@
               <w:noProof/>
             </w:rPr>
           </w:pPr>
-          <w:hyperlink w:anchor="_Toc242719235" w:history="1">
+          <w:hyperlink w:anchor="_Toc242721341" w:history="1">
             <w:r>
               <w:rPr>
                 <w:rStyle w:val="Hyperlink"/>
@@ -711,7 +711,7 @@
               <w:rPr>
                 <w:noProof/>
               </w:rPr>
-              <w:instrText xml:space="preserve"> PAGEREF _Toc242719235 \h </w:instrText>
+              <w:instrText xml:space="preserve"> PAGEREF _Toc242721341 \h </w:instrText>
             </w:r>
             <w:r>
               <w:rPr>
@@ -748,7 +748,7 @@
               <w:noProof/>
             </w:rPr>
           </w:pPr>
-          <w:hyperlink w:anchor="_Toc242719236" w:history="1">
+          <w:hyperlink w:anchor="_Toc242721342" w:history="1">
             <w:r>
               <w:rPr>
                 <w:rStyle w:val="Hyperlink"/>
@@ -772,7 +772,7 @@
               <w:rPr>
                 <w:noProof/>
               </w:rPr>
-              <w:instrText xml:space="preserve"> PAGEREF _Toc242719236 \h </w:instrText>
+              <w:instrText xml:space="preserve"> PAGEREF _Toc242721342 \h </w:instrText>
             </w:r>
             <w:r>
               <w:rPr>
@@ -809,7 +809,7 @@
               <w:noProof/>
             </w:rPr>
           </w:pPr>
-          <w:hyperlink w:anchor="_Toc242719237" w:history="1">
+          <w:hyperlink w:anchor="_Toc242721343" w:history="1">
             <w:r>
               <w:rPr>
                 <w:rStyle w:val="Hyperlink"/>
@@ -833,7 +833,7 @@
               <w:rPr>
                 <w:noProof/>
               </w:rPr>
-              <w:instrText xml:space="preserve"> PAGEREF _Toc242719237 \h </w:instrText>
+              <w:instrText xml:space="preserve"> PAGEREF _Toc242721343 \h </w:instrText>
             </w:r>
             <w:r>
               <w:rPr>
@@ -870,7 +870,7 @@
               <w:noProof/>
             </w:rPr>
           </w:pPr>
-          <w:hyperlink w:anchor="_Toc242719238" w:history="1">
+          <w:hyperlink w:anchor="_Toc242721344" w:history="1">
             <w:r>
               <w:rPr>
                 <w:rStyle w:val="Hyperlink"/>
@@ -894,7 +894,7 @@
               <w:rPr>
                 <w:noProof/>
               </w:rPr>
-              <w:instrText xml:space="preserve"> PAGEREF _Toc242719238 \h </w:instrText>
+              <w:instrText xml:space="preserve"> PAGEREF _Toc242721344 \h </w:instrText>
             </w:r>
             <w:r>
               <w:rPr>
@@ -931,7 +931,7 @@
               <w:noProof/>
             </w:rPr>
           </w:pPr>
-          <w:hyperlink w:anchor="_Toc242719239" w:history="1">
+          <w:hyperlink w:anchor="_Toc242721345" w:history="1">
             <w:r>
               <w:rPr>
                 <w:rStyle w:val="Hyperlink"/>
@@ -955,7 +955,7 @@
               <w:rPr>
                 <w:noProof/>
               </w:rPr>
-              <w:instrText xml:space="preserve"> PAGEREF _Toc242719239 \h </w:instrText>
+              <w:instrText xml:space="preserve"> PAGEREF _Toc242721345 \h </w:instrText>
             </w:r>
             <w:r>
               <w:rPr>
@@ -992,7 +992,7 @@
               <w:noProof/>
             </w:rPr>
           </w:pPr>
-          <w:hyperlink w:anchor="_Toc242719240" w:history="1">
+          <w:hyperlink w:anchor="_Toc242721346" w:history="1">
             <w:r>
               <w:rPr>
                 <w:rStyle w:val="Hyperlink"/>
@@ -1016,7 +1016,7 @@
               <w:rPr>
                 <w:noProof/>
               </w:rPr>
-              <w:instrText xml:space="preserve"> PAGEREF _Toc242719240 \h </w:instrText>
+              <w:instrText xml:space="preserve"> PAGEREF _Toc242721346 \h </w:instrText>
             </w:r>
             <w:r>
               <w:rPr>
@@ -1053,7 +1053,7 @@
               <w:noProof/>
             </w:rPr>
           </w:pPr>
-          <w:hyperlink w:anchor="_Toc242719241" w:history="1">
+          <w:hyperlink w:anchor="_Toc242721347" w:history="1">
             <w:r>
               <w:rPr>
                 <w:rStyle w:val="Hyperlink"/>
@@ -1077,7 +1077,7 @@
               <w:rPr>
                 <w:noProof/>
               </w:rPr>
-              <w:instrText xml:space="preserve"> PAGEREF _Toc242719241 \h </w:instrText>
+              <w:instrText xml:space="preserve"> PAGEREF _Toc242721347 \h </w:instrText>
             </w:r>
             <w:r>
               <w:rPr>
@@ -1114,7 +1114,7 @@
               <w:noProof/>
             </w:rPr>
           </w:pPr>
-          <w:hyperlink w:anchor="_Toc242719242" w:history="1">
+          <w:hyperlink w:anchor="_Toc242721348" w:history="1">
             <w:r>
               <w:rPr>
                 <w:rStyle w:val="Hyperlink"/>
@@ -1138,7 +1138,7 @@
               <w:rPr>
                 <w:noProof/>
               </w:rPr>
-              <w:instrText xml:space="preserve"> PAGEREF _Toc242719242 \h </w:instrText>
+              <w:instrText xml:space="preserve"> PAGEREF _Toc242721348 \h </w:instrText>
             </w:r>
             <w:r>
               <w:rPr>
@@ -1175,7 +1175,7 @@
               <w:noProof/>
             </w:rPr>
           </w:pPr>
-          <w:hyperlink w:anchor="_Toc242719243" w:history="1">
+          <w:hyperlink w:anchor="_Toc242721349" w:history="1">
             <w:r>
               <w:rPr>
                 <w:rStyle w:val="Hyperlink"/>
@@ -1199,7 +1199,7 @@
               <w:rPr>
                 <w:noProof/>
               </w:rPr>
-              <w:instrText xml:space="preserve"> PAGEREF _Toc242719243 \h </w:instrText>
+              <w:instrText xml:space="preserve"> PAGEREF _Toc242721349 \h </w:instrText>
             </w:r>
             <w:r>
               <w:rPr>
@@ -1236,7 +1236,7 @@
               <w:noProof/>
             </w:rPr>
           </w:pPr>
-          <w:hyperlink w:anchor="_Toc242719244" w:history="1">
+          <w:hyperlink w:anchor="_Toc242721350" w:history="1">
             <w:r>
               <w:rPr>
                 <w:rStyle w:val="Hyperlink"/>
@@ -1260,7 +1260,7 @@
               <w:rPr>
                 <w:noProof/>
               </w:rPr>
-              <w:instrText xml:space="preserve"> PAGEREF _Toc242719244 \h </w:instrText>
+              <w:instrText xml:space="preserve"> PAGEREF _Toc242721350 \h </w:instrText>
             </w:r>
             <w:r>
               <w:rPr>
@@ -1297,7 +1297,7 @@
               <w:noProof/>
             </w:rPr>
           </w:pPr>
-          <w:hyperlink w:anchor="_Toc242719245" w:history="1">
+          <w:hyperlink w:anchor="_Toc242721351" w:history="1">
             <w:r>
               <w:rPr>
                 <w:rStyle w:val="Hyperlink"/>
@@ -1321,7 +1321,7 @@
               <w:rPr>
                 <w:noProof/>
               </w:rPr>
-              <w:instrText xml:space="preserve"> PAGEREF _Toc242719245 \h </w:instrText>
+              <w:instrText xml:space="preserve"> PAGEREF _Toc242721351 \h </w:instrText>
             </w:r>
             <w:r>
               <w:rPr>
@@ -1358,7 +1358,7 @@
               <w:noProof/>
             </w:rPr>
           </w:pPr>
-          <w:hyperlink w:anchor="_Toc242719246" w:history="1">
+          <w:hyperlink w:anchor="_Toc242721352" w:history="1">
             <w:r>
               <w:rPr>
                 <w:rStyle w:val="Hyperlink"/>
@@ -1382,7 +1382,7 @@
               <w:rPr>
                 <w:noProof/>
               </w:rPr>
-              <w:instrText xml:space="preserve"> PAGEREF _Toc242719246 \h </w:instrText>
+              <w:instrText xml:space="preserve"> PAGEREF _Toc242721352 \h </w:instrText>
             </w:r>
             <w:r>
               <w:rPr>
@@ -1419,7 +1419,7 @@
               <w:noProof/>
             </w:rPr>
           </w:pPr>
-          <w:hyperlink w:anchor="_Toc242719247" w:history="1">
+          <w:hyperlink w:anchor="_Toc242721353" w:history="1">
             <w:r>
               <w:rPr>
                 <w:rStyle w:val="Hyperlink"/>
@@ -1443,7 +1443,7 @@
               <w:rPr>
                 <w:noProof/>
               </w:rPr>
-              <w:instrText xml:space="preserve"> PAGEREF _Toc242719247 \h </w:instrText>
+              <w:instrText xml:space="preserve"> PAGEREF _Toc242721353 \h </w:instrText>
             </w:r>
             <w:r>
               <w:rPr>
@@ -1480,7 +1480,7 @@
               <w:noProof/>
             </w:rPr>
           </w:pPr>
-          <w:hyperlink w:anchor="_Toc242719248" w:history="1">
+          <w:hyperlink w:anchor="_Toc242721354" w:history="1">
             <w:r>
               <w:rPr>
                 <w:rStyle w:val="Hyperlink"/>
@@ -1504,7 +1504,7 @@
               <w:rPr>
                 <w:noProof/>
               </w:rPr>
-              <w:instrText xml:space="preserve"> PAGEREF _Toc242719248 \h </w:instrText>
+              <w:instrText xml:space="preserve"> PAGEREF _Toc242721354 \h </w:instrText>
             </w:r>
             <w:r>
               <w:rPr>
@@ -1541,7 +1541,7 @@
               <w:noProof/>
             </w:rPr>
           </w:pPr>
-          <w:hyperlink w:anchor="_Toc242719249" w:history="1">
+          <w:hyperlink w:anchor="_Toc242721355" w:history="1">
             <w:r>
               <w:rPr>
                 <w:rStyle w:val="Hyperlink"/>
@@ -1565,7 +1565,7 @@
               <w:rPr>
                 <w:noProof/>
               </w:rPr>
-              <w:instrText xml:space="preserve"> PAGEREF _Toc242719249 \h </w:instrText>
+              <w:instrText xml:space="preserve"> PAGEREF _Toc242721355 \h </w:instrText>
             </w:r>
             <w:r>
               <w:rPr>
@@ -1602,7 +1602,7 @@
               <w:noProof/>
             </w:rPr>
           </w:pPr>
-          <w:hyperlink w:anchor="_Toc242719250" w:history="1">
+          <w:hyperlink w:anchor="_Toc242721356" w:history="1">
             <w:r>
               <w:rPr>
                 <w:rStyle w:val="Hyperlink"/>
@@ -1626,7 +1626,7 @@
               <w:rPr>
                 <w:noProof/>
               </w:rPr>
-              <w:instrText xml:space="preserve"> PAGEREF _Toc242719250 \h </w:instrText>
+              <w:instrText xml:space="preserve"> PAGEREF _Toc242721356 \h </w:instrText>
             </w:r>
             <w:r>
               <w:rPr>
@@ -1663,7 +1663,7 @@
               <w:noProof/>
             </w:rPr>
           </w:pPr>
-          <w:hyperlink w:anchor="_Toc242719251" w:history="1">
+          <w:hyperlink w:anchor="_Toc242721357" w:history="1">
             <w:r>
               <w:rPr>
                 <w:rStyle w:val="Hyperlink"/>
@@ -1687,7 +1687,7 @@
               <w:rPr>
                 <w:noProof/>
               </w:rPr>
-              <w:instrText xml:space="preserve"> PAGEREF _Toc242719251 \h </w:instrText>
+              <w:instrText xml:space="preserve"> PAGEREF _Toc242721357 \h </w:instrText>
             </w:r>
             <w:r>
               <w:rPr>
@@ -1724,7 +1724,7 @@
               <w:noProof/>
             </w:rPr>
           </w:pPr>
-          <w:hyperlink w:anchor="_Toc242719252" w:history="1">
+          <w:hyperlink w:anchor="_Toc242721358" w:history="1">
             <w:r>
               <w:rPr>
                 <w:rStyle w:val="Hyperlink"/>
@@ -1748,7 +1748,7 @@
               <w:rPr>
                 <w:noProof/>
               </w:rPr>
-              <w:instrText xml:space="preserve"> PAGEREF _Toc242719252 \h </w:instrText>
+              <w:instrText xml:space="preserve"> PAGEREF _Toc242721358 \h </w:instrText>
             </w:r>
             <w:r>
               <w:rPr>
@@ -1785,7 +1785,7 @@
               <w:noProof/>
             </w:rPr>
           </w:pPr>
-          <w:hyperlink w:anchor="_Toc242719253" w:history="1">
+          <w:hyperlink w:anchor="_Toc242721359" w:history="1">
             <w:r>
               <w:rPr>
                 <w:rStyle w:val="Hyperlink"/>
@@ -1809,7 +1809,7 @@
               <w:rPr>
                 <w:noProof/>
               </w:rPr>
-              <w:instrText xml:space="preserve"> PAGEREF _Toc242719253 \h </w:instrText>
+              <w:instrText xml:space="preserve"> PAGEREF _Toc242721359 \h </w:instrText>
             </w:r>
             <w:r>
               <w:rPr>
@@ -1846,7 +1846,7 @@
               <w:noProof/>
             </w:rPr>
           </w:pPr>
-          <w:hyperlink w:anchor="_Toc242719254" w:history="1">
+          <w:hyperlink w:anchor="_Toc242721360" w:history="1">
             <w:r>
               <w:rPr>
                 <w:rStyle w:val="Hyperlink"/>
@@ -1870,7 +1870,7 @@
               <w:rPr>
                 <w:noProof/>
               </w:rPr>
-              <w:instrText xml:space="preserve"> PAGEREF _Toc242719254 \h </w:instrText>
+              <w:instrText xml:space="preserve"> PAGEREF _Toc242721360 \h </w:instrText>
             </w:r>
             <w:r>
               <w:rPr>
@@ -1907,7 +1907,7 @@
               <w:noProof/>
             </w:rPr>
           </w:pPr>
-          <w:hyperlink w:anchor="_Toc242719255" w:history="1">
+          <w:hyperlink w:anchor="_Toc242721361" w:history="1">
             <w:r>
               <w:rPr>
                 <w:rStyle w:val="Hyperlink"/>
@@ -1931,7 +1931,7 @@
               <w:rPr>
                 <w:noProof/>
               </w:rPr>
-              <w:instrText xml:space="preserve"> PAGEREF _Toc242719255 \h </w:instrText>
+              <w:instrText xml:space="preserve"> PAGEREF _Toc242721361 \h </w:instrText>
             </w:r>
             <w:r>
               <w:rPr>
@@ -1968,7 +1968,7 @@
               <w:noProof/>
             </w:rPr>
           </w:pPr>
-          <w:hyperlink w:anchor="_Toc242719256" w:history="1">
+          <w:hyperlink w:anchor="_Toc242721362" w:history="1">
             <w:r>
               <w:rPr>
                 <w:rStyle w:val="Hyperlink"/>
@@ -1992,7 +1992,7 @@
               <w:rPr>
                 <w:noProof/>
               </w:rPr>
-              <w:instrText xml:space="preserve"> PAGEREF _Toc242719256 \h </w:instrText>
+              <w:instrText xml:space="preserve"> PAGEREF _Toc242721362 \h </w:instrText>
             </w:r>
             <w:r>
               <w:rPr>
@@ -2029,7 +2029,7 @@
               <w:noProof/>
             </w:rPr>
           </w:pPr>
-          <w:hyperlink w:anchor="_Toc242719257" w:history="1">
+          <w:hyperlink w:anchor="_Toc242721363" w:history="1">
             <w:r>
               <w:rPr>
                 <w:rStyle w:val="Hyperlink"/>
@@ -2053,7 +2053,7 @@
               <w:rPr>
                 <w:noProof/>
               </w:rPr>
-              <w:instrText xml:space="preserve"> PAGEREF _Toc242719257 \h </w:instrText>
+              <w:instrText xml:space="preserve"> PAGEREF _Toc242721363 \h </w:instrText>
             </w:r>
             <w:r>
               <w:rPr>
@@ -2090,7 +2090,7 @@
               <w:noProof/>
             </w:rPr>
           </w:pPr>
-          <w:hyperlink w:anchor="_Toc242719258" w:history="1">
+          <w:hyperlink w:anchor="_Toc242721364" w:history="1">
             <w:r>
               <w:rPr>
                 <w:rStyle w:val="Hyperlink"/>
@@ -2114,7 +2114,7 @@
               <w:rPr>
                 <w:noProof/>
               </w:rPr>
-              <w:instrText xml:space="preserve"> PAGEREF _Toc242719258 \h </w:instrText>
+              <w:instrText xml:space="preserve"> PAGEREF _Toc242721364 \h </w:instrText>
             </w:r>
             <w:r>
               <w:rPr>
@@ -2151,7 +2151,7 @@
               <w:noProof/>
             </w:rPr>
           </w:pPr>
-          <w:hyperlink w:anchor="_Toc242719259" w:history="1">
+          <w:hyperlink w:anchor="_Toc242721365" w:history="1">
             <w:r>
               <w:rPr>
                 <w:rStyle w:val="Hyperlink"/>
@@ -2175,7 +2175,7 @@
               <w:rPr>
                 <w:noProof/>
               </w:rPr>
-              <w:instrText xml:space="preserve"> PAGEREF _Toc242719259 \h </w:instrText>
+              <w:instrText xml:space="preserve"> PAGEREF _Toc242721365 \h </w:instrText>
             </w:r>
             <w:r>
               <w:rPr>
@@ -2212,7 +2212,7 @@
               <w:noProof/>
             </w:rPr>
           </w:pPr>
-          <w:hyperlink w:anchor="_Toc242719260" w:history="1">
+          <w:hyperlink w:anchor="_Toc242721366" w:history="1">
             <w:r>
               <w:rPr>
                 <w:rStyle w:val="Hyperlink"/>
@@ -2236,7 +2236,7 @@
               <w:rPr>
                 <w:noProof/>
               </w:rPr>
-              <w:instrText xml:space="preserve"> PAGEREF _Toc242719260 \h </w:instrText>
+              <w:instrText xml:space="preserve"> PAGEREF _Toc242721366 \h </w:instrText>
             </w:r>
             <w:r>
               <w:rPr>
@@ -2273,7 +2273,7 @@
               <w:noProof/>
             </w:rPr>
           </w:pPr>
-          <w:hyperlink w:anchor="_Toc242719261" w:history="1">
+          <w:hyperlink w:anchor="_Toc242721367" w:history="1">
             <w:r>
               <w:rPr>
                 <w:rStyle w:val="Hyperlink"/>
@@ -2297,7 +2297,7 @@
               <w:rPr>
                 <w:noProof/>
               </w:rPr>
-              <w:instrText xml:space="preserve"> PAGEREF _Toc242719261 \h </w:instrText>
+              <w:instrText xml:space="preserve"> PAGEREF _Toc242721367 \h </w:instrText>
             </w:r>
             <w:r>
               <w:rPr>
@@ -2334,7 +2334,7 @@
               <w:noProof/>
             </w:rPr>
           </w:pPr>
-          <w:hyperlink w:anchor="_Toc242719262" w:history="1">
+          <w:hyperlink w:anchor="_Toc242721368" w:history="1">
             <w:r>
               <w:rPr>
                 <w:rStyle w:val="Hyperlink"/>
@@ -2358,7 +2358,7 @@
               <w:rPr>
                 <w:noProof/>
               </w:rPr>
-              <w:instrText xml:space="preserve"> PAGEREF _Toc242719262 \h </w:instrText>
+              <w:instrText xml:space="preserve"> PAGEREF _Toc242721368 \h </w:instrText>
             </w:r>
             <w:r>
               <w:rPr>
@@ -2395,7 +2395,7 @@
               <w:noProof/>
             </w:rPr>
           </w:pPr>
-          <w:hyperlink w:anchor="_Toc242719263" w:history="1">
+          <w:hyperlink w:anchor="_Toc242721369" w:history="1">
             <w:r>
               <w:rPr>
                 <w:rStyle w:val="Hyperlink"/>
@@ -2419,7 +2419,7 @@
               <w:rPr>
                 <w:noProof/>
               </w:rPr>
-              <w:instrText xml:space="preserve"> PAGEREF _Toc242719263 \h </w:instrText>
+              <w:instrText xml:space="preserve"> PAGEREF _Toc242721369 \h </w:instrText>
             </w:r>
             <w:r>
               <w:rPr>
@@ -2456,7 +2456,7 @@
               <w:noProof/>
             </w:rPr>
           </w:pPr>
-          <w:hyperlink w:anchor="_Toc242719264" w:history="1">
+          <w:hyperlink w:anchor="_Toc242721370" w:history="1">
             <w:r>
               <w:rPr>
                 <w:rStyle w:val="Hyperlink"/>
@@ -2480,7 +2480,7 @@
               <w:rPr>
                 <w:noProof/>
               </w:rPr>
-              <w:instrText xml:space="preserve"> PAGEREF _Toc242719264 \h </w:instrText>
+              <w:instrText xml:space="preserve"> PAGEREF _Toc242721370 \h </w:instrText>
             </w:r>
             <w:r>
               <w:rPr>
@@ -2517,7 +2517,7 @@
               <w:noProof/>
             </w:rPr>
           </w:pPr>
-          <w:hyperlink w:anchor="_Toc242719265" w:history="1">
+          <w:hyperlink w:anchor="_Toc242721371" w:history="1">
             <w:r>
               <w:rPr>
                 <w:rStyle w:val="Hyperlink"/>
@@ -2541,7 +2541,7 @@
               <w:rPr>
                 <w:noProof/>
               </w:rPr>
-              <w:instrText xml:space="preserve"> PAGEREF _Toc242719265 \h </w:instrText>
+              <w:instrText xml:space="preserve"> PAGEREF _Toc242721371 \h </w:instrText>
             </w:r>
             <w:r>
               <w:rPr>
@@ -2578,7 +2578,7 @@
               <w:noProof/>
             </w:rPr>
           </w:pPr>
-          <w:hyperlink w:anchor="_Toc242719266" w:history="1">
+          <w:hyperlink w:anchor="_Toc242721372" w:history="1">
             <w:r>
               <w:rPr>
                 <w:rStyle w:val="Hyperlink"/>
@@ -2602,7 +2602,7 @@
               <w:rPr>
                 <w:noProof/>
               </w:rPr>
-              <w:instrText xml:space="preserve"> PAGEREF _Toc242719266 \h </w:instrText>
+              <w:instrText xml:space="preserve"> PAGEREF _Toc242721372 \h </w:instrText>
             </w:r>
             <w:r>
               <w:rPr>
@@ -2639,7 +2639,7 @@
               <w:noProof/>
             </w:rPr>
           </w:pPr>
-          <w:hyperlink w:anchor="_Toc242719267" w:history="1">
+          <w:hyperlink w:anchor="_Toc242721373" w:history="1">
             <w:r>
               <w:rPr>
                 <w:rStyle w:val="Hyperlink"/>
@@ -2663,7 +2663,7 @@
               <w:rPr>
                 <w:noProof/>
               </w:rPr>
-              <w:instrText xml:space="preserve"> PAGEREF _Toc242719267 \h </w:instrText>
+              <w:instrText xml:space="preserve"> PAGEREF _Toc242721373 \h </w:instrText>
             </w:r>
             <w:r>
               <w:rPr>
@@ -2700,7 +2700,7 @@
               <w:noProof/>
             </w:rPr>
           </w:pPr>
-          <w:hyperlink w:anchor="_Toc242719268" w:history="1">
+          <w:hyperlink w:anchor="_Toc242721374" w:history="1">
             <w:r>
               <w:rPr>
                 <w:rStyle w:val="Hyperlink"/>
@@ -2724,7 +2724,7 @@
               <w:rPr>
                 <w:noProof/>
               </w:rPr>
-              <w:instrText xml:space="preserve"> PAGEREF _Toc242719268 \h </w:instrText>
+              <w:instrText xml:space="preserve"> PAGEREF _Toc242721374 \h </w:instrText>
             </w:r>
             <w:r>
               <w:rPr>
@@ -2761,7 +2761,7 @@
               <w:noProof/>
             </w:rPr>
           </w:pPr>
-          <w:hyperlink w:anchor="_Toc242719269" w:history="1">
+          <w:hyperlink w:anchor="_Toc242721375" w:history="1">
             <w:r>
               <w:rPr>
                 <w:rStyle w:val="Hyperlink"/>
@@ -2785,7 +2785,7 @@
               <w:rPr>
                 <w:noProof/>
               </w:rPr>
-              <w:instrText xml:space="preserve"> PAGEREF _Toc242719269 \h </w:instrText>
+              <w:instrText xml:space="preserve"> PAGEREF _Toc242721375 \h </w:instrText>
             </w:r>
             <w:r>
               <w:rPr>
@@ -2822,7 +2822,7 @@
               <w:noProof/>
             </w:rPr>
           </w:pPr>
-          <w:hyperlink w:anchor="_Toc242719270" w:history="1">
+          <w:hyperlink w:anchor="_Toc242721376" w:history="1">
             <w:r>
               <w:rPr>
                 <w:rStyle w:val="Hyperlink"/>
@@ -2846,7 +2846,7 @@
               <w:rPr>
                 <w:noProof/>
               </w:rPr>
-              <w:instrText xml:space="preserve"> PAGEREF _Toc242719270 \h </w:instrText>
+              <w:instrText xml:space="preserve"> PAGEREF _Toc242721376 \h </w:instrText>
             </w:r>
             <w:r>
               <w:rPr>
@@ -2883,7 +2883,7 @@
               <w:noProof/>
             </w:rPr>
           </w:pPr>
-          <w:hyperlink w:anchor="_Toc242719271" w:history="1">
+          <w:hyperlink w:anchor="_Toc242721377" w:history="1">
             <w:r>
               <w:rPr>
                 <w:rStyle w:val="Hyperlink"/>
@@ -2907,7 +2907,7 @@
               <w:rPr>
                 <w:noProof/>
               </w:rPr>
-              <w:instrText xml:space="preserve"> PAGEREF _Toc242719271 \h </w:instrText>
+              <w:instrText xml:space="preserve"> PAGEREF _Toc242721377 \h </w:instrText>
             </w:r>
             <w:r>
               <w:rPr>
@@ -2944,7 +2944,7 @@
               <w:noProof/>
             </w:rPr>
           </w:pPr>
-          <w:hyperlink w:anchor="_Toc242719272" w:history="1">
+          <w:hyperlink w:anchor="_Toc242721378" w:history="1">
             <w:r>
               <w:rPr>
                 <w:rStyle w:val="Hyperlink"/>
@@ -2968,7 +2968,7 @@
               <w:rPr>
                 <w:noProof/>
               </w:rPr>
-              <w:instrText xml:space="preserve"> PAGEREF _Toc242719272 \h </w:instrText>
+              <w:instrText xml:space="preserve"> PAGEREF _Toc242721378 \h </w:instrText>
             </w:r>
             <w:r>
               <w:rPr>
@@ -3005,7 +3005,7 @@
               <w:noProof/>
             </w:rPr>
           </w:pPr>
-          <w:hyperlink w:anchor="_Toc242719273" w:history="1">
+          <w:hyperlink w:anchor="_Toc242721379" w:history="1">
             <w:r>
               <w:rPr>
                 <w:rStyle w:val="Hyperlink"/>
@@ -3029,7 +3029,7 @@
               <w:rPr>
                 <w:noProof/>
               </w:rPr>
-              <w:instrText xml:space="preserve"> PAGEREF _Toc242719273 \h </w:instrText>
+              <w:instrText xml:space="preserve"> PAGEREF _Toc242721379 \h </w:instrText>
             </w:r>
             <w:r>
               <w:rPr>
@@ -3066,7 +3066,7 @@
               <w:noProof/>
             </w:rPr>
           </w:pPr>
-          <w:hyperlink w:anchor="_Toc242719274" w:history="1">
+          <w:hyperlink w:anchor="_Toc242721380" w:history="1">
             <w:r>
               <w:rPr>
                 <w:rStyle w:val="Hyperlink"/>
@@ -3090,7 +3090,7 @@
               <w:rPr>
                 <w:noProof/>
               </w:rPr>
-              <w:instrText xml:space="preserve"> PAGEREF _Toc242719274 \h </w:instrText>
+              <w:instrText xml:space="preserve"> PAGEREF _Toc242721380 \h </w:instrText>
             </w:r>
             <w:r>
               <w:rPr>
@@ -3127,7 +3127,7 @@
               <w:noProof/>
             </w:rPr>
           </w:pPr>
-          <w:hyperlink w:anchor="_Toc242719275" w:history="1">
+          <w:hyperlink w:anchor="_Toc242721381" w:history="1">
             <w:r>
               <w:rPr>
                 <w:rStyle w:val="Hyperlink"/>
@@ -3151,7 +3151,7 @@
               <w:rPr>
                 <w:noProof/>
               </w:rPr>
-              <w:instrText xml:space="preserve"> PAGEREF _Toc242719275 \h </w:instrText>
+              <w:instrText xml:space="preserve"> PAGEREF _Toc242721381 \h </w:instrText>
             </w:r>
             <w:r>
               <w:rPr>
@@ -3188,7 +3188,7 @@
               <w:noProof/>
             </w:rPr>
           </w:pPr>
-          <w:hyperlink w:anchor="_Toc242719276" w:history="1">
+          <w:hyperlink w:anchor="_Toc242721382" w:history="1">
             <w:r>
               <w:rPr>
                 <w:rStyle w:val="Hyperlink"/>
@@ -3212,7 +3212,7 @@
               <w:rPr>
                 <w:noProof/>
               </w:rPr>
-              <w:instrText xml:space="preserve"> PAGEREF _Toc242719276 \h </w:instrText>
+              <w:instrText xml:space="preserve"> PAGEREF _Toc242721382 \h </w:instrText>
             </w:r>
             <w:r>
               <w:rPr>
@@ -3249,7 +3249,7 @@
               <w:noProof/>
             </w:rPr>
           </w:pPr>
-          <w:hyperlink w:anchor="_Toc242719277" w:history="1">
+          <w:hyperlink w:anchor="_Toc242721383" w:history="1">
             <w:r>
               <w:rPr>
                 <w:rStyle w:val="Hyperlink"/>
@@ -3273,7 +3273,7 @@
               <w:rPr>
                 <w:noProof/>
               </w:rPr>
-              <w:instrText xml:space="preserve"> PAGEREF _Toc242719277 \h </w:instrText>
+              <w:instrText xml:space="preserve"> PAGEREF _Toc242721383 \h </w:instrText>
             </w:r>
             <w:r>
               <w:rPr>
@@ -3310,7 +3310,7 @@
               <w:noProof/>
             </w:rPr>
           </w:pPr>
-          <w:hyperlink w:anchor="_Toc242719278" w:history="1">
+          <w:hyperlink w:anchor="_Toc242721384" w:history="1">
             <w:r>
               <w:rPr>
                 <w:rStyle w:val="Hyperlink"/>
@@ -3334,7 +3334,7 @@
               <w:rPr>
                 <w:noProof/>
               </w:rPr>
-              <w:instrText xml:space="preserve"> PAGEREF _Toc242719278 \h </w:instrText>
+              <w:instrText xml:space="preserve"> PAGEREF _Toc242721384 \h </w:instrText>
             </w:r>
             <w:r>
               <w:rPr>
@@ -3371,7 +3371,7 @@
               <w:noProof/>
             </w:rPr>
           </w:pPr>
-          <w:hyperlink w:anchor="_Toc242719279" w:history="1">
+          <w:hyperlink w:anchor="_Toc242721385" w:history="1">
             <w:r>
               <w:rPr>
                 <w:rStyle w:val="Hyperlink"/>
@@ -3395,7 +3395,7 @@
               <w:rPr>
                 <w:noProof/>
               </w:rPr>
-              <w:instrText xml:space="preserve"> PAGEREF _Toc242719279 \h </w:instrText>
+              <w:instrText xml:space="preserve"> PAGEREF _Toc242721385 \h </w:instrText>
             </w:r>
             <w:r>
               <w:rPr>
@@ -3432,7 +3432,7 @@
               <w:noProof/>
             </w:rPr>
           </w:pPr>
-          <w:hyperlink w:anchor="_Toc242719280" w:history="1">
+          <w:hyperlink w:anchor="_Toc242721386" w:history="1">
             <w:r>
               <w:rPr>
                 <w:rStyle w:val="Hyperlink"/>
@@ -3456,7 +3456,7 @@
               <w:rPr>
                 <w:noProof/>
               </w:rPr>
-              <w:instrText xml:space="preserve"> PAGEREF _Toc242719280 \h </w:instrText>
+              <w:instrText xml:space="preserve"> PAGEREF _Toc242721386 \h </w:instrText>
             </w:r>
             <w:r>
               <w:rPr>
@@ -3493,7 +3493,7 @@
               <w:noProof/>
             </w:rPr>
           </w:pPr>
-          <w:hyperlink w:anchor="_Toc242719281" w:history="1">
+          <w:hyperlink w:anchor="_Toc242721387" w:history="1">
             <w:r>
               <w:rPr>
                 <w:rStyle w:val="Hyperlink"/>
@@ -3517,7 +3517,7 @@
               <w:rPr>
                 <w:noProof/>
               </w:rPr>
-              <w:instrText xml:space="preserve"> PAGEREF _Toc242719281 \h </w:instrText>
+              <w:instrText xml:space="preserve"> PAGEREF _Toc242721387 \h </w:instrText>
             </w:r>
             <w:r>
               <w:rPr>
@@ -3554,7 +3554,7 @@
               <w:noProof/>
             </w:rPr>
           </w:pPr>
-          <w:hyperlink w:anchor="_Toc242719282" w:history="1">
+          <w:hyperlink w:anchor="_Toc242721388" w:history="1">
             <w:r>
               <w:rPr>
                 <w:rStyle w:val="Hyperlink"/>
@@ -3578,7 +3578,7 @@
               <w:rPr>
                 <w:noProof/>
               </w:rPr>
-              <w:instrText xml:space="preserve"> PAGEREF _Toc242719282 \h </w:instrText>
+              <w:instrText xml:space="preserve"> PAGEREF _Toc242721388 \h </w:instrText>
             </w:r>
             <w:r>
               <w:rPr>
@@ -3615,7 +3615,7 @@
               <w:noProof/>
             </w:rPr>
           </w:pPr>
-          <w:hyperlink w:anchor="_Toc242719283" w:history="1">
+          <w:hyperlink w:anchor="_Toc242721389" w:history="1">
             <w:r>
               <w:rPr>
                 <w:rStyle w:val="Hyperlink"/>
@@ -3639,7 +3639,7 @@
               <w:rPr>
                 <w:noProof/>
               </w:rPr>
-              <w:instrText xml:space="preserve"> PAGEREF _Toc242719283 \h </w:instrText>
+              <w:instrText xml:space="preserve"> PAGEREF _Toc242721389 \h </w:instrText>
             </w:r>
             <w:r>
               <w:rPr>
@@ -3676,7 +3676,7 @@
               <w:noProof/>
             </w:rPr>
           </w:pPr>
-          <w:hyperlink w:anchor="_Toc242719284" w:history="1">
+          <w:hyperlink w:anchor="_Toc242721390" w:history="1">
             <w:r>
               <w:rPr>
                 <w:rStyle w:val="Hyperlink"/>
@@ -3700,7 +3700,7 @@
               <w:rPr>
                 <w:noProof/>
               </w:rPr>
-              <w:instrText xml:space="preserve"> PAGEREF _Toc242719284 \h </w:instrText>
+              <w:instrText xml:space="preserve"> PAGEREF _Toc242721390 \h </w:instrText>
             </w:r>
             <w:r>
               <w:rPr>
@@ -3737,7 +3737,7 @@
               <w:noProof/>
             </w:rPr>
           </w:pPr>
-          <w:hyperlink w:anchor="_Toc242719285" w:history="1">
+          <w:hyperlink w:anchor="_Toc242721391" w:history="1">
             <w:r>
               <w:rPr>
                 <w:rStyle w:val="Hyperlink"/>
@@ -3761,7 +3761,7 @@
               <w:rPr>
                 <w:noProof/>
               </w:rPr>
-              <w:instrText xml:space="preserve"> PAGEREF _Toc242719285 \h </w:instrText>
+              <w:instrText xml:space="preserve"> PAGEREF _Toc242721391 \h </w:instrText>
             </w:r>
             <w:r>
               <w:rPr>
@@ -3798,7 +3798,7 @@
               <w:noProof/>
             </w:rPr>
           </w:pPr>
-          <w:hyperlink w:anchor="_Toc242719286" w:history="1">
+          <w:hyperlink w:anchor="_Toc242721392" w:history="1">
             <w:r>
               <w:rPr>
                 <w:rStyle w:val="Hyperlink"/>
@@ -3822,7 +3822,7 @@
               <w:rPr>
                 <w:noProof/>
               </w:rPr>
-              <w:instrText xml:space="preserve"> PAGEREF _Toc242719286 \h </w:instrText>
+              <w:instrText xml:space="preserve"> PAGEREF _Toc242721392 \h </w:instrText>
             </w:r>
             <w:r>
               <w:rPr>
@@ -3859,7 +3859,7 @@
               <w:noProof/>
             </w:rPr>
           </w:pPr>
-          <w:hyperlink w:anchor="_Toc242719287" w:history="1">
+          <w:hyperlink w:anchor="_Toc242721393" w:history="1">
             <w:r>
               <w:rPr>
                 <w:rStyle w:val="Hyperlink"/>
@@ -3883,7 +3883,7 @@
               <w:rPr>
                 <w:noProof/>
               </w:rPr>
-              <w:instrText xml:space="preserve"> PAGEREF _Toc242719287 \h </w:instrText>
+              <w:instrText xml:space="preserve"> PAGEREF _Toc242721393 \h </w:instrText>
             </w:r>
             <w:r>
               <w:rPr>
@@ -3920,7 +3920,7 @@
               <w:noProof/>
             </w:rPr>
           </w:pPr>
-          <w:hyperlink w:anchor="_Toc242719288" w:history="1">
+          <w:hyperlink w:anchor="_Toc242721394" w:history="1">
             <w:r>
               <w:rPr>
                 <w:rStyle w:val="Hyperlink"/>
@@ -3944,7 +3944,7 @@
               <w:rPr>
                 <w:noProof/>
               </w:rPr>
-              <w:instrText xml:space="preserve"> PAGEREF _Toc242719288 \h </w:instrText>
+              <w:instrText xml:space="preserve"> PAGEREF _Toc242721394 \h </w:instrText>
             </w:r>
             <w:r>
               <w:rPr>
@@ -3981,7 +3981,7 @@
               <w:noProof/>
             </w:rPr>
           </w:pPr>
-          <w:hyperlink w:anchor="_Toc242719289" w:history="1">
+          <w:hyperlink w:anchor="_Toc242721395" w:history="1">
             <w:r>
               <w:rPr>
                 <w:rStyle w:val="Hyperlink"/>
@@ -4005,7 +4005,7 @@
               <w:rPr>
                 <w:noProof/>
               </w:rPr>
-              <w:instrText xml:space="preserve"> PAGEREF _Toc242719289 \h </w:instrText>
+              <w:instrText xml:space="preserve"> PAGEREF _Toc242721395 \h </w:instrText>
             </w:r>
             <w:r>
               <w:rPr>
@@ -4042,7 +4042,7 @@
               <w:noProof/>
             </w:rPr>
           </w:pPr>
-          <w:hyperlink w:anchor="_Toc242719290" w:history="1">
+          <w:hyperlink w:anchor="_Toc242721396" w:history="1">
             <w:r>
               <w:rPr>
                 <w:rStyle w:val="Hyperlink"/>
@@ -4066,7 +4066,7 @@
               <w:rPr>
                 <w:noProof/>
               </w:rPr>
-              <w:instrText xml:space="preserve"> PAGEREF _Toc242719290 \h </w:instrText>
+              <w:instrText xml:space="preserve"> PAGEREF _Toc242721396 \h </w:instrText>
             </w:r>
             <w:r>
               <w:rPr>
@@ -4103,7 +4103,7 @@
               <w:noProof/>
             </w:rPr>
           </w:pPr>
-          <w:hyperlink w:anchor="_Toc242719291" w:history="1">
+          <w:hyperlink w:anchor="_Toc242721397" w:history="1">
             <w:r>
               <w:rPr>
                 <w:rStyle w:val="Hyperlink"/>
@@ -4127,7 +4127,7 @@
               <w:rPr>
                 <w:noProof/>
               </w:rPr>
-              <w:instrText xml:space="preserve"> PAGEREF _Toc242719291 \h </w:instrText>
+              <w:instrText xml:space="preserve"> PAGEREF _Toc242721397 \h </w:instrText>
             </w:r>
             <w:r>
               <w:rPr>
@@ -4164,7 +4164,7 @@
               <w:noProof/>
             </w:rPr>
           </w:pPr>
-          <w:hyperlink w:anchor="_Toc242719292" w:history="1">
+          <w:hyperlink w:anchor="_Toc242721398" w:history="1">
             <w:r>
               <w:rPr>
                 <w:rStyle w:val="Hyperlink"/>
@@ -4188,7 +4188,7 @@
               <w:rPr>
                 <w:noProof/>
               </w:rPr>
-              <w:instrText xml:space="preserve"> PAGEREF _Toc242719292 \h </w:instrText>
+              <w:instrText xml:space="preserve"> PAGEREF _Toc242721398 \h </w:instrText>
             </w:r>
             <w:r>
               <w:rPr>
@@ -4225,7 +4225,7 @@
               <w:noProof/>
             </w:rPr>
           </w:pPr>
-          <w:hyperlink w:anchor="_Toc242719293" w:history="1">
+          <w:hyperlink w:anchor="_Toc242721399" w:history="1">
             <w:r>
               <w:rPr>
                 <w:rStyle w:val="Hyperlink"/>
@@ -4249,7 +4249,7 @@
               <w:rPr>
                 <w:noProof/>
               </w:rPr>
-              <w:instrText xml:space="preserve"> PAGEREF _Toc242719293 \h </w:instrText>
+              <w:instrText xml:space="preserve"> PAGEREF _Toc242721399 \h </w:instrText>
             </w:r>
             <w:r>
               <w:rPr>
@@ -4286,7 +4286,7 @@
               <w:noProof/>
             </w:rPr>
           </w:pPr>
-          <w:hyperlink w:anchor="_Toc242719294" w:history="1">
+          <w:hyperlink w:anchor="_Toc242721400" w:history="1">
             <w:r>
               <w:rPr>
                 <w:rStyle w:val="Hyperlink"/>
@@ -4310,7 +4310,7 @@
               <w:rPr>
                 <w:noProof/>
               </w:rPr>
-              <w:instrText xml:space="preserve"> PAGEREF _Toc242719294 \h </w:instrText>
+              <w:instrText xml:space="preserve"> PAGEREF _Toc242721400 \h </w:instrText>
             </w:r>
             <w:r>
               <w:rPr>
@@ -4347,7 +4347,7 @@
               <w:noProof/>
             </w:rPr>
           </w:pPr>
-          <w:hyperlink w:anchor="_Toc242719295" w:history="1">
+          <w:hyperlink w:anchor="_Toc242721401" w:history="1">
             <w:r>
               <w:rPr>
                 <w:rStyle w:val="Hyperlink"/>
@@ -4371,7 +4371,7 @@
               <w:rPr>
                 <w:noProof/>
               </w:rPr>
-              <w:instrText xml:space="preserve"> PAGEREF _Toc242719295 \h </w:instrText>
+              <w:instrText xml:space="preserve"> PAGEREF _Toc242721401 \h </w:instrText>
             </w:r>
             <w:r>
               <w:rPr>
@@ -4408,7 +4408,7 @@
               <w:noProof/>
             </w:rPr>
           </w:pPr>
-          <w:hyperlink w:anchor="_Toc242719296" w:history="1">
+          <w:hyperlink w:anchor="_Toc242721402" w:history="1">
             <w:r>
               <w:rPr>
                 <w:rStyle w:val="Hyperlink"/>
@@ -4432,7 +4432,7 @@
               <w:rPr>
                 <w:noProof/>
               </w:rPr>
-              <w:instrText xml:space="preserve"> PAGEREF _Toc242719296 \h </w:instrText>
+              <w:instrText xml:space="preserve"> PAGEREF _Toc242721402 \h </w:instrText>
             </w:r>
             <w:r>
               <w:rPr>
@@ -4469,7 +4469,7 @@
               <w:noProof/>
             </w:rPr>
           </w:pPr>
-          <w:hyperlink w:anchor="_Toc242719297" w:history="1">
+          <w:hyperlink w:anchor="_Toc242721403" w:history="1">
             <w:r>
               <w:rPr>
                 <w:rStyle w:val="Hyperlink"/>
@@ -4493,7 +4493,7 @@
               <w:rPr>
                 <w:noProof/>
               </w:rPr>
-              <w:instrText xml:space="preserve"> PAGEREF _Toc242719297 \h </w:instrText>
+              <w:instrText xml:space="preserve"> PAGEREF _Toc242721403 \h </w:instrText>
             </w:r>
             <w:r>
               <w:rPr>
@@ -4530,7 +4530,7 @@
               <w:noProof/>
             </w:rPr>
           </w:pPr>
-          <w:hyperlink w:anchor="_Toc242719298" w:history="1">
+          <w:hyperlink w:anchor="_Toc242721404" w:history="1">
             <w:r>
               <w:rPr>
                 <w:rStyle w:val="Hyperlink"/>
@@ -4554,7 +4554,7 @@
               <w:rPr>
                 <w:noProof/>
               </w:rPr>
-              <w:instrText xml:space="preserve"> PAGEREF _Toc242719298 \h </w:instrText>
+              <w:instrText xml:space="preserve"> PAGEREF _Toc242721404 \h </w:instrText>
             </w:r>
             <w:r>
               <w:rPr>
@@ -4591,7 +4591,7 @@
               <w:noProof/>
             </w:rPr>
           </w:pPr>
-          <w:hyperlink w:anchor="_Toc242719299" w:history="1">
+          <w:hyperlink w:anchor="_Toc242721405" w:history="1">
             <w:r>
               <w:rPr>
                 <w:rStyle w:val="Hyperlink"/>
@@ -4615,7 +4615,7 @@
               <w:rPr>
                 <w:noProof/>
               </w:rPr>
-              <w:instrText xml:space="preserve"> PAGEREF _Toc242719299 \h </w:instrText>
+              <w:instrText xml:space="preserve"> PAGEREF _Toc242721405 \h </w:instrText>
             </w:r>
             <w:r>
               <w:rPr>
@@ -4652,7 +4652,7 @@
               <w:noProof/>
             </w:rPr>
           </w:pPr>
-          <w:hyperlink w:anchor="_Toc242719300" w:history="1">
+          <w:hyperlink w:anchor="_Toc242721406" w:history="1">
             <w:r>
               <w:rPr>
                 <w:rStyle w:val="Hyperlink"/>
@@ -4676,7 +4676,7 @@
               <w:rPr>
                 <w:noProof/>
               </w:rPr>
-              <w:instrText xml:space="preserve"> PAGEREF _Toc242719300 \h </w:instrText>
+              <w:instrText xml:space="preserve"> PAGEREF _Toc242721406 \h </w:instrText>
             </w:r>
             <w:r>
               <w:rPr>
@@ -4713,7 +4713,7 @@
               <w:noProof/>
             </w:rPr>
           </w:pPr>
-          <w:hyperlink w:anchor="_Toc242719301" w:history="1">
+          <w:hyperlink w:anchor="_Toc242721407" w:history="1">
             <w:r>
               <w:rPr>
                 <w:rStyle w:val="Hyperlink"/>
@@ -4737,7 +4737,7 @@
               <w:rPr>
                 <w:noProof/>
               </w:rPr>
-              <w:instrText xml:space="preserve"> PAGEREF _Toc242719301 \h </w:instrText>
+              <w:instrText xml:space="preserve"> PAGEREF _Toc242721407 \h </w:instrText>
             </w:r>
             <w:r>
               <w:rPr>
@@ -4774,7 +4774,7 @@
               <w:noProof/>
             </w:rPr>
           </w:pPr>
-          <w:hyperlink w:anchor="_Toc242719302" w:history="1">
+          <w:hyperlink w:anchor="_Toc242721408" w:history="1">
             <w:r>
               <w:rPr>
                 <w:rStyle w:val="Hyperlink"/>
@@ -4798,7 +4798,7 @@
               <w:rPr>
                 <w:noProof/>
               </w:rPr>
-              <w:instrText xml:space="preserve"> PAGEREF _Toc242719302 \h </w:instrText>
+              <w:instrText xml:space="preserve"> PAGEREF _Toc242721408 \h </w:instrText>
             </w:r>
             <w:r>
               <w:rPr>
@@ -4835,7 +4835,7 @@
               <w:noProof/>
             </w:rPr>
           </w:pPr>
-          <w:hyperlink w:anchor="_Toc242719303" w:history="1">
+          <w:hyperlink w:anchor="_Toc242721409" w:history="1">
             <w:r>
               <w:rPr>
                 <w:rStyle w:val="Hyperlink"/>
@@ -4859,7 +4859,7 @@
               <w:rPr>
                 <w:noProof/>
               </w:rPr>
-              <w:instrText xml:space="preserve"> PAGEREF _Toc242719303 \h </w:instrText>
+              <w:instrText xml:space="preserve"> PAGEREF _Toc242721409 \h </w:instrText>
             </w:r>
             <w:r>
               <w:rPr>
@@ -4896,7 +4896,7 @@
               <w:noProof/>
             </w:rPr>
           </w:pPr>
-          <w:hyperlink w:anchor="_Toc242719304" w:history="1">
+          <w:hyperlink w:anchor="_Toc242721410" w:history="1">
             <w:r>
               <w:rPr>
                 <w:rStyle w:val="Hyperlink"/>
@@ -4920,7 +4920,7 @@
               <w:rPr>
                 <w:noProof/>
               </w:rPr>
-              <w:instrText xml:space="preserve"> PAGEREF _Toc242719304 \h </w:instrText>
+              <w:instrText xml:space="preserve"> PAGEREF _Toc242721410 \h </w:instrText>
             </w:r>
             <w:r>
               <w:rPr>
@@ -4957,7 +4957,7 @@
               <w:noProof/>
             </w:rPr>
           </w:pPr>
-          <w:hyperlink w:anchor="_Toc242719305" w:history="1">
+          <w:hyperlink w:anchor="_Toc242721411" w:history="1">
             <w:r>
               <w:rPr>
                 <w:rStyle w:val="Hyperlink"/>
@@ -4981,7 +4981,7 @@
               <w:rPr>
                 <w:noProof/>
               </w:rPr>
-              <w:instrText xml:space="preserve"> PAGEREF _Toc242719305 \h </w:instrText>
+              <w:instrText xml:space="preserve"> PAGEREF _Toc242721411 \h </w:instrText>
             </w:r>
             <w:r>
               <w:rPr>
@@ -5018,7 +5018,7 @@
               <w:noProof/>
             </w:rPr>
           </w:pPr>
-          <w:hyperlink w:anchor="_Toc242719306" w:history="1">
+          <w:hyperlink w:anchor="_Toc242721412" w:history="1">
             <w:r>
               <w:rPr>
                 <w:rStyle w:val="Hyperlink"/>
@@ -5042,7 +5042,7 @@
               <w:rPr>
                 <w:noProof/>
               </w:rPr>
-              <w:instrText xml:space="preserve"> PAGEREF _Toc242719306 \h </w:instrText>
+              <w:instrText xml:space="preserve"> PAGEREF _Toc242721412 \h </w:instrText>
             </w:r>
             <w:r>
               <w:rPr>
@@ -5059,7 +5059,7 @@
               <w:rPr>
                 <w:noProof/>
               </w:rPr>
-              <w:t>34</w:t>
+              <w:t>35</w:t>
             </w:r>
             <w:r>
               <w:rPr>
@@ -5079,7 +5079,7 @@
               <w:noProof/>
             </w:rPr>
           </w:pPr>
-          <w:hyperlink w:anchor="_Toc242719307" w:history="1">
+          <w:hyperlink w:anchor="_Toc242721413" w:history="1">
             <w:r>
               <w:rPr>
                 <w:rStyle w:val="Hyperlink"/>
@@ -5103,7 +5103,7 @@
               <w:rPr>
                 <w:noProof/>
               </w:rPr>
-              <w:instrText xml:space="preserve"> PAGEREF _Toc242719307 \h </w:instrText>
+              <w:instrText xml:space="preserve"> PAGEREF _Toc242721413 \h </w:instrText>
             </w:r>
             <w:r>
               <w:rPr>
@@ -5120,7 +5120,7 @@
               <w:rPr>
                 <w:noProof/>
               </w:rPr>
-              <w:t>34</w:t>
+              <w:t>35</w:t>
             </w:r>
             <w:r>
               <w:rPr>
@@ -5140,7 +5140,7 @@
               <w:noProof/>
             </w:rPr>
           </w:pPr>
-          <w:hyperlink w:anchor="_Toc242719308" w:history="1">
+          <w:hyperlink w:anchor="_Toc242721414" w:history="1">
             <w:r>
               <w:rPr>
                 <w:rStyle w:val="Hyperlink"/>
@@ -5164,7 +5164,7 @@
               <w:rPr>
                 <w:noProof/>
               </w:rPr>
-              <w:instrText xml:space="preserve"> PAGEREF _Toc242719308 \h </w:instrText>
+              <w:instrText xml:space="preserve"> PAGEREF _Toc242721414 \h </w:instrText>
             </w:r>
             <w:r>
               <w:rPr>
@@ -5181,7 +5181,7 @@
               <w:rPr>
                 <w:noProof/>
               </w:rPr>
-              <w:t>36</w:t>
+              <w:t>37</w:t>
             </w:r>
             <w:r>
               <w:rPr>
@@ -5201,7 +5201,7 @@
               <w:noProof/>
             </w:rPr>
           </w:pPr>
-          <w:hyperlink w:anchor="_Toc242719309" w:history="1">
+          <w:hyperlink w:anchor="_Toc242721415" w:history="1">
             <w:r>
               <w:rPr>
                 <w:rStyle w:val="Hyperlink"/>
@@ -5225,7 +5225,7 @@
               <w:rPr>
                 <w:noProof/>
               </w:rPr>
-              <w:instrText xml:space="preserve"> PAGEREF _Toc242719309 \h </w:instrText>
+              <w:instrText xml:space="preserve"> PAGEREF _Toc242721415 \h </w:instrText>
             </w:r>
             <w:r>
               <w:rPr>
@@ -5242,7 +5242,7 @@
               <w:rPr>
                 <w:noProof/>
               </w:rPr>
-              <w:t>36</w:t>
+              <w:t>37</w:t>
             </w:r>
             <w:r>
               <w:rPr>
@@ -5262,7 +5262,7 @@
               <w:noProof/>
             </w:rPr>
           </w:pPr>
-          <w:hyperlink w:anchor="_Toc242719310" w:history="1">
+          <w:hyperlink w:anchor="_Toc242721416" w:history="1">
             <w:r>
               <w:rPr>
                 <w:rStyle w:val="Hyperlink"/>
@@ -5286,7 +5286,7 @@
               <w:rPr>
                 <w:noProof/>
               </w:rPr>
-              <w:instrText xml:space="preserve"> PAGEREF _Toc242719310 \h </w:instrText>
+              <w:instrText xml:space="preserve"> PAGEREF _Toc242721416 \h </w:instrText>
             </w:r>
             <w:r>
               <w:rPr>
@@ -5303,7 +5303,7 @@
               <w:rPr>
                 <w:noProof/>
               </w:rPr>
-              <w:t>37</w:t>
+              <w:t>38</w:t>
             </w:r>
             <w:r>
               <w:rPr>
@@ -5323,7 +5323,7 @@
               <w:noProof/>
             </w:rPr>
           </w:pPr>
-          <w:hyperlink w:anchor="_Toc242719311" w:history="1">
+          <w:hyperlink w:anchor="_Toc242721417" w:history="1">
             <w:r>
               <w:rPr>
                 <w:rStyle w:val="Hyperlink"/>
@@ -5347,7 +5347,7 @@
               <w:rPr>
                 <w:noProof/>
               </w:rPr>
-              <w:instrText xml:space="preserve"> PAGEREF _Toc242719311 \h </w:instrText>
+              <w:instrText xml:space="preserve"> PAGEREF _Toc242721417 \h </w:instrText>
             </w:r>
             <w:r>
               <w:rPr>
@@ -5364,7 +5364,7 @@
               <w:rPr>
                 <w:noProof/>
               </w:rPr>
-              <w:t>38</w:t>
+              <w:t>39</w:t>
             </w:r>
             <w:r>
               <w:rPr>
@@ -5384,7 +5384,7 @@
               <w:noProof/>
             </w:rPr>
           </w:pPr>
-          <w:hyperlink w:anchor="_Toc242719312" w:history="1">
+          <w:hyperlink w:anchor="_Toc242721418" w:history="1">
             <w:r>
               <w:rPr>
                 <w:rStyle w:val="Hyperlink"/>
@@ -5408,7 +5408,7 @@
               <w:rPr>
                 <w:noProof/>
               </w:rPr>
-              <w:instrText xml:space="preserve"> PAGEREF _Toc242719312 \h </w:instrText>
+              <w:instrText xml:space="preserve"> PAGEREF _Toc242721418 \h </w:instrText>
             </w:r>
             <w:r>
               <w:rPr>
@@ -5425,7 +5425,7 @@
               <w:rPr>
                 <w:noProof/>
               </w:rPr>
-              <w:t>38</w:t>
+              <w:t>39</w:t>
             </w:r>
             <w:r>
               <w:rPr>
@@ -5445,7 +5445,7 @@
               <w:noProof/>
             </w:rPr>
           </w:pPr>
-          <w:hyperlink w:anchor="_Toc242719313" w:history="1">
+          <w:hyperlink w:anchor="_Toc242721419" w:history="1">
             <w:r>
               <w:rPr>
                 <w:rStyle w:val="Hyperlink"/>
@@ -5469,7 +5469,7 @@
               <w:rPr>
                 <w:noProof/>
               </w:rPr>
-              <w:instrText xml:space="preserve"> PAGEREF _Toc242719313 \h </w:instrText>
+              <w:instrText xml:space="preserve"> PAGEREF _Toc242721419 \h </w:instrText>
             </w:r>
             <w:r>
               <w:rPr>
@@ -5486,7 +5486,7 @@
               <w:rPr>
                 <w:noProof/>
               </w:rPr>
-              <w:t>39</w:t>
+              <w:t>40</w:t>
             </w:r>
             <w:r>
               <w:rPr>
@@ -5506,7 +5506,7 @@
               <w:noProof/>
             </w:rPr>
           </w:pPr>
-          <w:hyperlink w:anchor="_Toc242719314" w:history="1">
+          <w:hyperlink w:anchor="_Toc242721420" w:history="1">
             <w:r>
               <w:rPr>
                 <w:rStyle w:val="Hyperlink"/>
@@ -5530,7 +5530,7 @@
               <w:rPr>
                 <w:noProof/>
               </w:rPr>
-              <w:instrText xml:space="preserve"> PAGEREF _Toc242719314 \h </w:instrText>
+              <w:instrText xml:space="preserve"> PAGEREF _Toc242721420 \h </w:instrText>
             </w:r>
             <w:r>
               <w:rPr>
@@ -5547,7 +5547,7 @@
               <w:rPr>
                 <w:noProof/>
               </w:rPr>
-              <w:t>39</w:t>
+              <w:t>40</w:t>
             </w:r>
             <w:r>
               <w:rPr>
@@ -5567,7 +5567,7 @@
               <w:noProof/>
             </w:rPr>
           </w:pPr>
-          <w:hyperlink w:anchor="_Toc242719315" w:history="1">
+          <w:hyperlink w:anchor="_Toc242721421" w:history="1">
             <w:r>
               <w:rPr>
                 <w:rStyle w:val="Hyperlink"/>
@@ -5591,7 +5591,7 @@
               <w:rPr>
                 <w:noProof/>
               </w:rPr>
-              <w:instrText xml:space="preserve"> PAGEREF _Toc242719315 \h </w:instrText>
+              <w:instrText xml:space="preserve"> PAGEREF _Toc242721421 \h </w:instrText>
             </w:r>
             <w:r>
               <w:rPr>
@@ -5608,7 +5608,7 @@
               <w:rPr>
                 <w:noProof/>
               </w:rPr>
-              <w:t>40</w:t>
+              <w:t>41</w:t>
             </w:r>
             <w:r>
               <w:rPr>
@@ -5628,7 +5628,7 @@
               <w:noProof/>
             </w:rPr>
           </w:pPr>
-          <w:hyperlink w:anchor="_Toc242719316" w:history="1">
+          <w:hyperlink w:anchor="_Toc242721422" w:history="1">
             <w:r>
               <w:rPr>
                 <w:rStyle w:val="Hyperlink"/>
@@ -5652,7 +5652,7 @@
               <w:rPr>
                 <w:noProof/>
               </w:rPr>
-              <w:instrText xml:space="preserve"> PAGEREF _Toc242719316 \h </w:instrText>
+              <w:instrText xml:space="preserve"> PAGEREF _Toc242721422 \h </w:instrText>
             </w:r>
             <w:r>
               <w:rPr>
@@ -5669,7 +5669,7 @@
               <w:rPr>
                 <w:noProof/>
               </w:rPr>
-              <w:t>40</w:t>
+              <w:t>41</w:t>
             </w:r>
             <w:r>
               <w:rPr>
@@ -5689,7 +5689,7 @@
               <w:noProof/>
             </w:rPr>
           </w:pPr>
-          <w:hyperlink w:anchor="_Toc242719317" w:history="1">
+          <w:hyperlink w:anchor="_Toc242721423" w:history="1">
             <w:r>
               <w:rPr>
                 <w:rStyle w:val="Hyperlink"/>
@@ -5713,7 +5713,7 @@
               <w:rPr>
                 <w:noProof/>
               </w:rPr>
-              <w:instrText xml:space="preserve"> PAGEREF _Toc242719317 \h </w:instrText>
+              <w:instrText xml:space="preserve"> PAGEREF _Toc242721423 \h </w:instrText>
             </w:r>
             <w:r>
               <w:rPr>
@@ -5730,7 +5730,7 @@
               <w:rPr>
                 <w:noProof/>
               </w:rPr>
-              <w:t>40</w:t>
+              <w:t>41</w:t>
             </w:r>
             <w:r>
               <w:rPr>
@@ -5750,7 +5750,7 @@
               <w:noProof/>
             </w:rPr>
           </w:pPr>
-          <w:hyperlink w:anchor="_Toc242719318" w:history="1">
+          <w:hyperlink w:anchor="_Toc242721424" w:history="1">
             <w:r>
               <w:rPr>
                 <w:rStyle w:val="Hyperlink"/>
@@ -5774,7 +5774,7 @@
               <w:rPr>
                 <w:noProof/>
               </w:rPr>
-              <w:instrText xml:space="preserve"> PAGEREF _Toc242719318 \h </w:instrText>
+              <w:instrText xml:space="preserve"> PAGEREF _Toc242721424 \h </w:instrText>
             </w:r>
             <w:r>
               <w:rPr>
@@ -5791,7 +5791,7 @@
               <w:rPr>
                 <w:noProof/>
               </w:rPr>
-              <w:t>41</w:t>
+              <w:t>42</w:t>
             </w:r>
             <w:r>
               <w:rPr>
@@ -5811,7 +5811,7 @@
               <w:noProof/>
             </w:rPr>
           </w:pPr>
-          <w:hyperlink w:anchor="_Toc242719319" w:history="1">
+          <w:hyperlink w:anchor="_Toc242721425" w:history="1">
             <w:r>
               <w:rPr>
                 <w:rStyle w:val="Hyperlink"/>
@@ -5835,7 +5835,7 @@
               <w:rPr>
                 <w:noProof/>
               </w:rPr>
-              <w:instrText xml:space="preserve"> PAGEREF _Toc242719319 \h </w:instrText>
+              <w:instrText xml:space="preserve"> PAGEREF _Toc242721425 \h </w:instrText>
             </w:r>
             <w:r>
               <w:rPr>
@@ -5852,7 +5852,7 @@
               <w:rPr>
                 <w:noProof/>
               </w:rPr>
-              <w:t>41</w:t>
+              <w:t>42</w:t>
             </w:r>
             <w:r>
               <w:rPr>
@@ -5872,7 +5872,7 @@
               <w:noProof/>
             </w:rPr>
           </w:pPr>
-          <w:hyperlink w:anchor="_Toc242719320" w:history="1">
+          <w:hyperlink w:anchor="_Toc242721426" w:history="1">
             <w:r>
               <w:rPr>
                 <w:rStyle w:val="Hyperlink"/>
@@ -5896,7 +5896,7 @@
               <w:rPr>
                 <w:noProof/>
               </w:rPr>
-              <w:instrText xml:space="preserve"> PAGEREF _Toc242719320 \h </w:instrText>
+              <w:instrText xml:space="preserve"> PAGEREF _Toc242721426 \h </w:instrText>
             </w:r>
             <w:r>
               <w:rPr>
@@ -5913,7 +5913,7 @@
               <w:rPr>
                 <w:noProof/>
               </w:rPr>
-              <w:t>41</w:t>
+              <w:t>42</w:t>
             </w:r>
             <w:r>
               <w:rPr>
@@ -5933,7 +5933,7 @@
               <w:noProof/>
             </w:rPr>
           </w:pPr>
-          <w:hyperlink w:anchor="_Toc242719321" w:history="1">
+          <w:hyperlink w:anchor="_Toc242721427" w:history="1">
             <w:r>
               <w:rPr>
                 <w:rStyle w:val="Hyperlink"/>
@@ -5957,7 +5957,7 @@
               <w:rPr>
                 <w:noProof/>
               </w:rPr>
-              <w:instrText xml:space="preserve"> PAGEREF _Toc242719321 \h </w:instrText>
+              <w:instrText xml:space="preserve"> PAGEREF _Toc242721427 \h </w:instrText>
             </w:r>
             <w:r>
               <w:rPr>
@@ -5974,7 +5974,7 @@
               <w:rPr>
                 <w:noProof/>
               </w:rPr>
-              <w:t>41</w:t>
+              <w:t>42</w:t>
             </w:r>
             <w:r>
               <w:rPr>
@@ -5994,7 +5994,7 @@
               <w:noProof/>
             </w:rPr>
           </w:pPr>
-          <w:hyperlink w:anchor="_Toc242719322" w:history="1">
+          <w:hyperlink w:anchor="_Toc242721428" w:history="1">
             <w:r>
               <w:rPr>
                 <w:rStyle w:val="Hyperlink"/>
@@ -6018,7 +6018,7 @@
               <w:rPr>
                 <w:noProof/>
               </w:rPr>
-              <w:instrText xml:space="preserve"> PAGEREF _Toc242719322 \h </w:instrText>
+              <w:instrText xml:space="preserve"> PAGEREF _Toc242721428 \h </w:instrText>
             </w:r>
             <w:r>
               <w:rPr>
@@ -6035,7 +6035,7 @@
               <w:rPr>
                 <w:noProof/>
               </w:rPr>
-              <w:t>42</w:t>
+              <w:t>43</w:t>
             </w:r>
             <w:r>
               <w:rPr>
@@ -6055,7 +6055,7 @@
               <w:noProof/>
             </w:rPr>
           </w:pPr>
-          <w:hyperlink w:anchor="_Toc242719323" w:history="1">
+          <w:hyperlink w:anchor="_Toc242721429" w:history="1">
             <w:r>
               <w:rPr>
                 <w:rStyle w:val="Hyperlink"/>
@@ -6079,7 +6079,7 @@
               <w:rPr>
                 <w:noProof/>
               </w:rPr>
-              <w:instrText xml:space="preserve"> PAGEREF _Toc242719323 \h </w:instrText>
+              <w:instrText xml:space="preserve"> PAGEREF _Toc242721429 \h </w:instrText>
             </w:r>
             <w:r>
               <w:rPr>
@@ -6096,7 +6096,7 @@
               <w:rPr>
                 <w:noProof/>
               </w:rPr>
-              <w:t>43</w:t>
+              <w:t>44</w:t>
             </w:r>
             <w:r>
               <w:rPr>
@@ -6116,7 +6116,7 @@
               <w:noProof/>
             </w:rPr>
           </w:pPr>
-          <w:hyperlink w:anchor="_Toc242719324" w:history="1">
+          <w:hyperlink w:anchor="_Toc242721430" w:history="1">
             <w:r>
               <w:rPr>
                 <w:rStyle w:val="Hyperlink"/>
@@ -6140,7 +6140,7 @@
               <w:rPr>
                 <w:noProof/>
               </w:rPr>
-              <w:instrText xml:space="preserve"> PAGEREF _Toc242719324 \h </w:instrText>
+              <w:instrText xml:space="preserve"> PAGEREF _Toc242721430 \h </w:instrText>
             </w:r>
             <w:r>
               <w:rPr>
@@ -6157,7 +6157,7 @@
               <w:rPr>
                 <w:noProof/>
               </w:rPr>
-              <w:t>43</w:t>
+              <w:t>44</w:t>
             </w:r>
             <w:r>
               <w:rPr>
@@ -6177,7 +6177,7 @@
               <w:noProof/>
             </w:rPr>
           </w:pPr>
-          <w:hyperlink w:anchor="_Toc242719325" w:history="1">
+          <w:hyperlink w:anchor="_Toc242721431" w:history="1">
             <w:r>
               <w:rPr>
                 <w:rStyle w:val="Hyperlink"/>
@@ -6201,7 +6201,7 @@
               <w:rPr>
                 <w:noProof/>
               </w:rPr>
-              <w:instrText xml:space="preserve"> PAGEREF _Toc242719325 \h </w:instrText>
+              <w:instrText xml:space="preserve"> PAGEREF _Toc242721431 \h </w:instrText>
             </w:r>
             <w:r>
               <w:rPr>
@@ -6218,7 +6218,7 @@
               <w:rPr>
                 <w:noProof/>
               </w:rPr>
-              <w:t>44</w:t>
+              <w:t>45</w:t>
             </w:r>
             <w:r>
               <w:rPr>
@@ -6238,7 +6238,7 @@
               <w:noProof/>
             </w:rPr>
           </w:pPr>
-          <w:hyperlink w:anchor="_Toc242719326" w:history="1">
+          <w:hyperlink w:anchor="_Toc242721432" w:history="1">
             <w:r>
               <w:rPr>
                 <w:rStyle w:val="Hyperlink"/>
@@ -6262,7 +6262,7 @@
               <w:rPr>
                 <w:noProof/>
               </w:rPr>
-              <w:instrText xml:space="preserve"> PAGEREF _Toc242719326 \h </w:instrText>
+              <w:instrText xml:space="preserve"> PAGEREF _Toc242721432 \h </w:instrText>
             </w:r>
             <w:r>
               <w:rPr>
@@ -6279,7 +6279,7 @@
               <w:rPr>
                 <w:noProof/>
               </w:rPr>
-              <w:t>45</w:t>
+              <w:t>46</w:t>
             </w:r>
             <w:r>
               <w:rPr>
@@ -6299,7 +6299,7 @@
               <w:noProof/>
             </w:rPr>
           </w:pPr>
-          <w:hyperlink w:anchor="_Toc242719327" w:history="1">
+          <w:hyperlink w:anchor="_Toc242721433" w:history="1">
             <w:r>
               <w:rPr>
                 <w:rStyle w:val="Hyperlink"/>
@@ -6323,7 +6323,7 @@
               <w:rPr>
                 <w:noProof/>
               </w:rPr>
-              <w:instrText xml:space="preserve"> PAGEREF _Toc242719327 \h </w:instrText>
+              <w:instrText xml:space="preserve"> PAGEREF _Toc242721433 \h </w:instrText>
             </w:r>
             <w:r>
               <w:rPr>
@@ -6340,7 +6340,7 @@
               <w:rPr>
                 <w:noProof/>
               </w:rPr>
-              <w:t>45</w:t>
+              <w:t>46</w:t>
             </w:r>
             <w:r>
               <w:rPr>
@@ -6360,7 +6360,7 @@
               <w:noProof/>
             </w:rPr>
           </w:pPr>
-          <w:hyperlink w:anchor="_Toc242719328" w:history="1">
+          <w:hyperlink w:anchor="_Toc242721434" w:history="1">
             <w:r>
               <w:rPr>
                 <w:rStyle w:val="Hyperlink"/>
@@ -6384,7 +6384,7 @@
               <w:rPr>
                 <w:noProof/>
               </w:rPr>
-              <w:instrText xml:space="preserve"> PAGEREF _Toc242719328 \h </w:instrText>
+              <w:instrText xml:space="preserve"> PAGEREF _Toc242721434 \h </w:instrText>
             </w:r>
             <w:r>
               <w:rPr>
@@ -6401,7 +6401,7 @@
               <w:rPr>
                 <w:noProof/>
               </w:rPr>
-              <w:t>45</w:t>
+              <w:t>46</w:t>
             </w:r>
             <w:r>
               <w:rPr>
@@ -6421,7 +6421,7 @@
               <w:noProof/>
             </w:rPr>
           </w:pPr>
-          <w:hyperlink w:anchor="_Toc242719329" w:history="1">
+          <w:hyperlink w:anchor="_Toc242721435" w:history="1">
             <w:r>
               <w:rPr>
                 <w:rStyle w:val="Hyperlink"/>
@@ -6445,7 +6445,7 @@
               <w:rPr>
                 <w:noProof/>
               </w:rPr>
-              <w:instrText xml:space="preserve"> PAGEREF _Toc242719329 \h </w:instrText>
+              <w:instrText xml:space="preserve"> PAGEREF _Toc242721435 \h </w:instrText>
             </w:r>
             <w:r>
               <w:rPr>
@@ -6462,7 +6462,7 @@
               <w:rPr>
                 <w:noProof/>
               </w:rPr>
-              <w:t>45</w:t>
+              <w:t>46</w:t>
             </w:r>
             <w:r>
               <w:rPr>
@@ -6482,7 +6482,7 @@
               <w:noProof/>
             </w:rPr>
           </w:pPr>
-          <w:hyperlink w:anchor="_Toc242719330" w:history="1">
+          <w:hyperlink w:anchor="_Toc242721436" w:history="1">
             <w:r>
               <w:rPr>
                 <w:rStyle w:val="Hyperlink"/>
@@ -6506,7 +6506,7 @@
               <w:rPr>
                 <w:noProof/>
               </w:rPr>
-              <w:instrText xml:space="preserve"> PAGEREF _Toc242719330 \h </w:instrText>
+              <w:instrText xml:space="preserve"> PAGEREF _Toc242721436 \h </w:instrText>
             </w:r>
             <w:r>
               <w:rPr>
@@ -6523,7 +6523,7 @@
               <w:rPr>
                 <w:noProof/>
               </w:rPr>
-              <w:t>46</w:t>
+              <w:t>47</w:t>
             </w:r>
             <w:r>
               <w:rPr>
@@ -6543,7 +6543,7 @@
               <w:noProof/>
             </w:rPr>
           </w:pPr>
-          <w:hyperlink w:anchor="_Toc242719331" w:history="1">
+          <w:hyperlink w:anchor="_Toc242721437" w:history="1">
             <w:r>
               <w:rPr>
                 <w:rStyle w:val="Hyperlink"/>
@@ -6567,7 +6567,7 @@
               <w:rPr>
                 <w:noProof/>
               </w:rPr>
-              <w:instrText xml:space="preserve"> PAGEREF _Toc242719331 \h </w:instrText>
+              <w:instrText xml:space="preserve"> PAGEREF _Toc242721437 \h </w:instrText>
             </w:r>
             <w:r>
               <w:rPr>
@@ -6584,7 +6584,7 @@
               <w:rPr>
                 <w:noProof/>
               </w:rPr>
-              <w:t>46</w:t>
+              <w:t>47</w:t>
             </w:r>
             <w:r>
               <w:rPr>
@@ -6604,7 +6604,7 @@
               <w:noProof/>
             </w:rPr>
           </w:pPr>
-          <w:hyperlink w:anchor="_Toc242719332" w:history="1">
+          <w:hyperlink w:anchor="_Toc242721438" w:history="1">
             <w:r>
               <w:rPr>
                 <w:rStyle w:val="Hyperlink"/>
@@ -6628,7 +6628,7 @@
               <w:rPr>
                 <w:noProof/>
               </w:rPr>
-              <w:instrText xml:space="preserve"> PAGEREF _Toc242719332 \h </w:instrText>
+              <w:instrText xml:space="preserve"> PAGEREF _Toc242721438 \h </w:instrText>
             </w:r>
             <w:r>
               <w:rPr>
@@ -6645,7 +6645,7 @@
               <w:rPr>
                 <w:noProof/>
               </w:rPr>
-              <w:t>46</w:t>
+              <w:t>48</w:t>
             </w:r>
             <w:r>
               <w:rPr>
@@ -6665,7 +6665,7 @@
               <w:noProof/>
             </w:rPr>
           </w:pPr>
-          <w:hyperlink w:anchor="_Toc242719333" w:history="1">
+          <w:hyperlink w:anchor="_Toc242721439" w:history="1">
             <w:r>
               <w:rPr>
                 <w:rStyle w:val="Hyperlink"/>
@@ -6689,7 +6689,7 @@
               <w:rPr>
                 <w:noProof/>
               </w:rPr>
-              <w:instrText xml:space="preserve"> PAGEREF _Toc242719333 \h </w:instrText>
+              <w:instrText xml:space="preserve"> PAGEREF _Toc242721439 \h </w:instrText>
             </w:r>
             <w:r>
               <w:rPr>
@@ -6706,7 +6706,7 @@
               <w:rPr>
                 <w:noProof/>
               </w:rPr>
-              <w:t>47</w:t>
+              <w:t>48</w:t>
             </w:r>
             <w:r>
               <w:rPr>
@@ -6726,7 +6726,7 @@
               <w:noProof/>
             </w:rPr>
           </w:pPr>
-          <w:hyperlink w:anchor="_Toc242719334" w:history="1">
+          <w:hyperlink w:anchor="_Toc242721440" w:history="1">
             <w:r>
               <w:rPr>
                 <w:rStyle w:val="Hyperlink"/>
@@ -6750,7 +6750,7 @@
               <w:rPr>
                 <w:noProof/>
               </w:rPr>
-              <w:instrText xml:space="preserve"> PAGEREF _Toc242719334 \h </w:instrText>
+              <w:instrText xml:space="preserve"> PAGEREF _Toc242721440 \h </w:instrText>
             </w:r>
             <w:r>
               <w:rPr>
@@ -6767,7 +6767,7 @@
               <w:rPr>
                 <w:noProof/>
               </w:rPr>
-              <w:t>48</w:t>
+              <w:t>49</w:t>
             </w:r>
             <w:r>
               <w:rPr>
@@ -6787,7 +6787,7 @@
               <w:noProof/>
             </w:rPr>
           </w:pPr>
-          <w:hyperlink w:anchor="_Toc242719335" w:history="1">
+          <w:hyperlink w:anchor="_Toc242721441" w:history="1">
             <w:r>
               <w:rPr>
                 <w:rStyle w:val="Hyperlink"/>
@@ -6811,7 +6811,7 @@
               <w:rPr>
                 <w:noProof/>
               </w:rPr>
-              <w:instrText xml:space="preserve"> PAGEREF _Toc242719335 \h </w:instrText>
+              <w:instrText xml:space="preserve"> PAGEREF _Toc242721441 \h </w:instrText>
             </w:r>
             <w:r>
               <w:rPr>
@@ -6828,7 +6828,7 @@
               <w:rPr>
                 <w:noProof/>
               </w:rPr>
-              <w:t>50</w:t>
+              <w:t>51</w:t>
             </w:r>
             <w:r>
               <w:rPr>
@@ -6848,7 +6848,7 @@
               <w:noProof/>
             </w:rPr>
           </w:pPr>
-          <w:hyperlink w:anchor="_Toc242719336" w:history="1">
+          <w:hyperlink w:anchor="_Toc242721442" w:history="1">
             <w:r>
               <w:rPr>
                 <w:rStyle w:val="Hyperlink"/>
@@ -6872,7 +6872,7 @@
               <w:rPr>
                 <w:noProof/>
               </w:rPr>
-              <w:instrText xml:space="preserve"> PAGEREF _Toc242719336 \h </w:instrText>
+              <w:instrText xml:space="preserve"> PAGEREF _Toc242721442 \h </w:instrText>
             </w:r>
             <w:r>
               <w:rPr>
@@ -6889,7 +6889,7 @@
               <w:rPr>
                 <w:noProof/>
               </w:rPr>
-              <w:t>50</w:t>
+              <w:t>51</w:t>
             </w:r>
             <w:r>
               <w:rPr>
@@ -6909,7 +6909,7 @@
               <w:noProof/>
             </w:rPr>
           </w:pPr>
-          <w:hyperlink w:anchor="_Toc242719337" w:history="1">
+          <w:hyperlink w:anchor="_Toc242721443" w:history="1">
             <w:r>
               <w:rPr>
                 <w:rStyle w:val="Hyperlink"/>
@@ -6933,7 +6933,7 @@
               <w:rPr>
                 <w:noProof/>
               </w:rPr>
-              <w:instrText xml:space="preserve"> PAGEREF _Toc242719337 \h </w:instrText>
+              <w:instrText xml:space="preserve"> PAGEREF _Toc242721443 \h </w:instrText>
             </w:r>
             <w:r>
               <w:rPr>
@@ -6950,7 +6950,7 @@
               <w:rPr>
                 <w:noProof/>
               </w:rPr>
-              <w:t>50</w:t>
+              <w:t>51</w:t>
             </w:r>
             <w:r>
               <w:rPr>
@@ -6970,7 +6970,7 @@
               <w:noProof/>
             </w:rPr>
           </w:pPr>
-          <w:hyperlink w:anchor="_Toc242719338" w:history="1">
+          <w:hyperlink w:anchor="_Toc242721444" w:history="1">
             <w:r>
               <w:rPr>
                 <w:rStyle w:val="Hyperlink"/>
@@ -6994,7 +6994,7 @@
               <w:rPr>
                 <w:noProof/>
               </w:rPr>
-              <w:instrText xml:space="preserve"> PAGEREF _Toc242719338 \h </w:instrText>
+              <w:instrText xml:space="preserve"> PAGEREF _Toc242721444 \h </w:instrText>
             </w:r>
             <w:r>
               <w:rPr>
@@ -7011,7 +7011,7 @@
               <w:rPr>
                 <w:noProof/>
               </w:rPr>
-              <w:t>50</w:t>
+              <w:t>51</w:t>
             </w:r>
             <w:r>
               <w:rPr>
@@ -7031,7 +7031,7 @@
               <w:noProof/>
             </w:rPr>
           </w:pPr>
-          <w:hyperlink w:anchor="_Toc242719339" w:history="1">
+          <w:hyperlink w:anchor="_Toc242721445" w:history="1">
             <w:r>
               <w:rPr>
                 <w:rStyle w:val="Hyperlink"/>
@@ -7055,7 +7055,7 @@
               <w:rPr>
                 <w:noProof/>
               </w:rPr>
-              <w:instrText xml:space="preserve"> PAGEREF _Toc242719339 \h </w:instrText>
+              <w:instrText xml:space="preserve"> PAGEREF _Toc242721445 \h </w:instrText>
             </w:r>
             <w:r>
               <w:rPr>
@@ -7072,7 +7072,7 @@
               <w:rPr>
                 <w:noProof/>
               </w:rPr>
-              <w:t>51</w:t>
+              <w:t>52</w:t>
             </w:r>
             <w:r>
               <w:rPr>
@@ -7109,7 +7109,7 @@
         <w:pageBreakBefore/>
         <w:jc w:val="center"/>
       </w:pPr>
-      <w:bookmarkStart w:id="6" w:name="_Toc242719236"/>
+      <w:bookmarkStart w:id="6" w:name="_Toc242721342"/>
       <w:r>
         <w:lastRenderedPageBreak/>
         <w:t>CHAPTER ONE</w:t>
@@ -7124,7 +7124,7 @@
       <w:pPr>
         <w:pStyle w:val="Heading2"/>
       </w:pPr>
-      <w:bookmarkStart w:id="7" w:name="_Toc242719237"/>
+      <w:bookmarkStart w:id="7" w:name="_Toc242721343"/>
       <w:r>
         <w:t>1.1 Background of the Study</w:t>
       </w:r>
@@ -7193,7 +7193,7 @@
       <w:pPr>
         <w:pStyle w:val="Heading2"/>
       </w:pPr>
-      <w:bookmarkStart w:id="8" w:name="_Toc242719238"/>
+      <w:bookmarkStart w:id="8" w:name="_Toc242721344"/>
       <w:r>
         <w:lastRenderedPageBreak/>
         <w:t>1.2 Statement of the Problem</w:t>
@@ -7305,7 +7305,7 @@
       <w:pPr>
         <w:pStyle w:val="Heading2"/>
       </w:pPr>
-      <w:bookmarkStart w:id="9" w:name="_Toc242719239"/>
+      <w:bookmarkStart w:id="9" w:name="_Toc242721345"/>
       <w:r>
         <w:t>1.3 Aim and Objectives of the Study</w:t>
       </w:r>
@@ -7456,7 +7456,7 @@
       <w:pPr>
         <w:pStyle w:val="Heading2"/>
       </w:pPr>
-      <w:bookmarkStart w:id="10" w:name="_Toc242719240"/>
+      <w:bookmarkStart w:id="10" w:name="_Toc242721346"/>
       <w:r>
         <w:t>1.4 Research Questions</w:t>
       </w:r>
@@ -7542,7 +7542,7 @@
       <w:pPr>
         <w:pStyle w:val="Heading2"/>
       </w:pPr>
-      <w:bookmarkStart w:id="11" w:name="_Toc242719241"/>
+      <w:bookmarkStart w:id="11" w:name="_Toc242721347"/>
       <w:r>
         <w:t>1.5 Significance of the Study</w:t>
       </w:r>
@@ -7661,7 +7661,7 @@
       <w:pPr>
         <w:pStyle w:val="Heading2"/>
       </w:pPr>
-      <w:bookmarkStart w:id="12" w:name="_Toc242719242"/>
+      <w:bookmarkStart w:id="12" w:name="_Toc242721348"/>
       <w:r>
         <w:t>1.6 Scope of the Study</w:t>
       </w:r>
@@ -7685,7 +7685,7 @@
       <w:pPr>
         <w:pStyle w:val="Heading2"/>
       </w:pPr>
-      <w:bookmarkStart w:id="13" w:name="_Toc242719243"/>
+      <w:bookmarkStart w:id="13" w:name="_Toc242721349"/>
       <w:r>
         <w:t>1.7 Limitations of the Study</w:t>
       </w:r>
@@ -7750,10 +7750,10 @@
         <w:jc w:val="both"/>
       </w:pPr>
       <w:r>
-        <w:t>Sample data were used for hotels, guides and prices. Real operational data wo</w:t>
-      </w:r>
-      <w:r>
-        <w:t>uld be entered by the tourism authority after adoption.</w:t>
+        <w:t>Sample data were used for hotels, guides and prices, and the sample photograp</w:t>
+      </w:r>
+      <w:r>
+        <w:t>hs are freely licensed images from Wikimedia Commons. Because the hotels are sample entries, their pictures show scenery of the area rather than the hotel. Real operational data and photographs would be entered by the tourism authority after adoption.</w:t>
       </w:r>
     </w:p>
     <w:p>
@@ -7767,14 +7767,17 @@
         <w:jc w:val="both"/>
       </w:pPr>
       <w:r>
-        <w:t>Time and financial constraints limited the study to a web application; no native mobile application was developed.</w:t>
+        <w:t>Time</w:t>
+      </w:r>
+      <w:r>
+        <w:t xml:space="preserve"> and financial constraints limited the study to a web application; no native mobile application was developed.</w:t>
       </w:r>
     </w:p>
     <w:p>
       <w:pPr>
         <w:pStyle w:val="Heading2"/>
       </w:pPr>
-      <w:bookmarkStart w:id="14" w:name="_Toc242719244"/>
+      <w:bookmarkStart w:id="14" w:name="_Toc242721350"/>
       <w:r>
         <w:t>1.8 Definition of Terms</w:t>
       </w:r>
@@ -7958,6 +7961,7 @@
                 <w:sz w:val="20"/>
                 <w:szCs w:val="20"/>
               </w:rPr>
+              <w:lastRenderedPageBreak/>
               <w:t>Destination</w:t>
             </w:r>
           </w:p>
@@ -8021,7 +8025,6 @@
                 <w:sz w:val="20"/>
                 <w:szCs w:val="20"/>
               </w:rPr>
-              <w:lastRenderedPageBreak/>
               <w:t>Tour package</w:t>
             </w:r>
           </w:p>
@@ -8521,7 +8524,7 @@
       <w:pPr>
         <w:pStyle w:val="Heading2"/>
       </w:pPr>
-      <w:bookmarkStart w:id="15" w:name="_Toc242719245"/>
+      <w:bookmarkStart w:id="15" w:name="_Toc242721351"/>
       <w:r>
         <w:t>1.9 Organisation of the Study</w:t>
       </w:r>
@@ -8547,7 +8550,7 @@
         <w:pageBreakBefore/>
         <w:jc w:val="center"/>
       </w:pPr>
-      <w:bookmarkStart w:id="16" w:name="_Toc242719246"/>
+      <w:bookmarkStart w:id="16" w:name="_Toc242721352"/>
       <w:r>
         <w:lastRenderedPageBreak/>
         <w:t>CHAPTER TWO</w:t>
@@ -8562,7 +8565,7 @@
       <w:pPr>
         <w:pStyle w:val="Heading2"/>
       </w:pPr>
-      <w:bookmarkStart w:id="17" w:name="_Toc242719247"/>
+      <w:bookmarkStart w:id="17" w:name="_Toc242721353"/>
       <w:r>
         <w:t>2.1 Introduction</w:t>
       </w:r>
@@ -8586,7 +8589,7 @@
       <w:pPr>
         <w:pStyle w:val="Heading2"/>
       </w:pPr>
-      <w:bookmarkStart w:id="18" w:name="_Toc242719248"/>
+      <w:bookmarkStart w:id="18" w:name="_Toc242721354"/>
       <w:r>
         <w:t>2.2 Concept of Tourism and Tourism Management</w:t>
       </w:r>
@@ -8621,7 +8624,7 @@
       <w:pPr>
         <w:pStyle w:val="Heading2"/>
       </w:pPr>
-      <w:bookmarkStart w:id="19" w:name="_Toc242719249"/>
+      <w:bookmarkStart w:id="19" w:name="_Toc242721355"/>
       <w:r>
         <w:t>2.3 Information and Communication Technology in Tourism</w:t>
       </w:r>
@@ -8677,7 +8680,7 @@
       <w:pPr>
         <w:pStyle w:val="Heading2"/>
       </w:pPr>
-      <w:bookmarkStart w:id="20" w:name="_Toc242719250"/>
+      <w:bookmarkStart w:id="20" w:name="_Toc242721356"/>
       <w:r>
         <w:t>2.4 Tourism in Liberia</w:t>
       </w:r>
@@ -8715,7 +8718,7 @@
       <w:pPr>
         <w:pStyle w:val="Heading2"/>
       </w:pPr>
-      <w:bookmarkStart w:id="21" w:name="_Toc242719251"/>
+      <w:bookmarkStart w:id="21" w:name="_Toc242721357"/>
       <w:r>
         <w:t>2.5 Review of Existing Tourism Information Systems</w:t>
       </w:r>
@@ -8733,7 +8736,7 @@
       <w:pPr>
         <w:pStyle w:val="Heading3"/>
       </w:pPr>
-      <w:bookmarkStart w:id="22" w:name="_Toc242719252"/>
+      <w:bookmarkStart w:id="22" w:name="_Toc242721358"/>
       <w:r>
         <w:lastRenderedPageBreak/>
         <w:t>2.5.1 Online trave</w:t>
@@ -8758,7 +8761,7 @@
       <w:pPr>
         <w:pStyle w:val="Heading3"/>
       </w:pPr>
-      <w:bookmarkStart w:id="23" w:name="_Toc242719253"/>
+      <w:bookmarkStart w:id="23" w:name="_Toc242721359"/>
       <w:r>
         <w:t>2.5.2 Destination management systems</w:t>
       </w:r>
@@ -8782,7 +8785,7 @@
       <w:pPr>
         <w:pStyle w:val="Heading3"/>
       </w:pPr>
-      <w:bookmarkStart w:id="24" w:name="_Toc242719254"/>
+      <w:bookmarkStart w:id="24" w:name="_Toc242721360"/>
       <w:r>
         <w:t>2.5.3 National tourism portals</w:t>
       </w:r>
@@ -8803,7 +8806,7 @@
       <w:pPr>
         <w:pStyle w:val="Heading3"/>
       </w:pPr>
-      <w:bookmarkStart w:id="25" w:name="_Toc242719255"/>
+      <w:bookmarkStart w:id="25" w:name="_Toc242721361"/>
       <w:r>
         <w:t>2.5.4 Comparison with the proposed system</w:t>
       </w:r>
@@ -9842,7 +9845,7 @@
       <w:pPr>
         <w:pStyle w:val="Heading2"/>
       </w:pPr>
-      <w:bookmarkStart w:id="26" w:name="_Toc242719256"/>
+      <w:bookmarkStart w:id="26" w:name="_Toc242721362"/>
       <w:r>
         <w:lastRenderedPageBreak/>
         <w:t>2.6 Review of Technologies Used</w:t>
@@ -9853,7 +9856,7 @@
       <w:pPr>
         <w:pStyle w:val="Heading3"/>
       </w:pPr>
-      <w:bookmarkStart w:id="27" w:name="_Toc242719257"/>
+      <w:bookmarkStart w:id="27" w:name="_Toc242721363"/>
       <w:r>
         <w:t>2.6.1 Web-based applications</w:t>
       </w:r>
@@ -9874,7 +9877,7 @@
       <w:pPr>
         <w:pStyle w:val="Heading3"/>
       </w:pPr>
-      <w:bookmarkStart w:id="28" w:name="_Toc242719258"/>
+      <w:bookmarkStart w:id="28" w:name="_Toc242721364"/>
       <w:r>
         <w:t>2.6.2 HTML5, CSS3 and JavaScript</w:t>
       </w:r>
@@ -9895,7 +9898,7 @@
       <w:pPr>
         <w:pStyle w:val="Heading3"/>
       </w:pPr>
-      <w:bookmarkStart w:id="29" w:name="_Toc242719259"/>
+      <w:bookmarkStart w:id="29" w:name="_Toc242721365"/>
       <w:r>
         <w:t>2.6.3 PHP</w:t>
       </w:r>
@@ -9916,7 +9919,7 @@
       <w:pPr>
         <w:pStyle w:val="Heading3"/>
       </w:pPr>
-      <w:bookmarkStart w:id="30" w:name="_Toc242719260"/>
+      <w:bookmarkStart w:id="30" w:name="_Toc242721366"/>
       <w:r>
         <w:t>2.6.4 MySQL and the relational model</w:t>
       </w:r>
@@ -9940,7 +9943,7 @@
       <w:pPr>
         <w:pStyle w:val="Heading3"/>
       </w:pPr>
-      <w:bookmarkStart w:id="31" w:name="_Toc242719261"/>
+      <w:bookmarkStart w:id="31" w:name="_Toc242721367"/>
       <w:r>
         <w:t>2.6.5 Web application security</w:t>
       </w:r>
@@ -9968,7 +9971,7 @@
       <w:pPr>
         <w:pStyle w:val="Heading3"/>
       </w:pPr>
-      <w:bookmarkStart w:id="32" w:name="_Toc242719262"/>
+      <w:bookmarkStart w:id="32" w:name="_Toc242721368"/>
       <w:r>
         <w:t>2.6.6 Usability</w:t>
       </w:r>
@@ -9989,7 +9992,7 @@
       <w:pPr>
         <w:pStyle w:val="Heading2"/>
       </w:pPr>
-      <w:bookmarkStart w:id="33" w:name="_Toc242719263"/>
+      <w:bookmarkStart w:id="33" w:name="_Toc242721369"/>
       <w:r>
         <w:t>2.7 Theoretical Framework</w:t>
       </w:r>
@@ -10016,7 +10019,7 @@
       <w:pPr>
         <w:pStyle w:val="Heading2"/>
       </w:pPr>
-      <w:bookmarkStart w:id="34" w:name="_Toc242719264"/>
+      <w:bookmarkStart w:id="34" w:name="_Toc242721370"/>
       <w:r>
         <w:t>2.8 Research Gap and Summary</w:t>
       </w:r>
@@ -10042,7 +10045,7 @@
         <w:pageBreakBefore/>
         <w:jc w:val="center"/>
       </w:pPr>
-      <w:bookmarkStart w:id="35" w:name="_Toc242719265"/>
+      <w:bookmarkStart w:id="35" w:name="_Toc242721371"/>
       <w:r>
         <w:lastRenderedPageBreak/>
         <w:t>CHAPTER THREE</w:t>
@@ -10057,7 +10060,7 @@
       <w:pPr>
         <w:pStyle w:val="Heading2"/>
       </w:pPr>
-      <w:bookmarkStart w:id="36" w:name="_Toc242719266"/>
+      <w:bookmarkStart w:id="36" w:name="_Toc242721372"/>
       <w:r>
         <w:t>3.1 Introduction</w:t>
       </w:r>
@@ -10078,7 +10081,7 @@
       <w:pPr>
         <w:pStyle w:val="Heading2"/>
       </w:pPr>
-      <w:bookmarkStart w:id="37" w:name="_Toc242719267"/>
+      <w:bookmarkStart w:id="37" w:name="_Toc242721373"/>
       <w:r>
         <w:t>3.2 Research Design</w:t>
       </w:r>
@@ -10102,7 +10105,7 @@
       <w:pPr>
         <w:pStyle w:val="Heading2"/>
       </w:pPr>
-      <w:bookmarkStart w:id="38" w:name="_Toc242719268"/>
+      <w:bookmarkStart w:id="38" w:name="_Toc242721374"/>
       <w:r>
         <w:t>3.3 Software Development Model: The Waterfall Model</w:t>
       </w:r>
@@ -10189,7 +10192,7 @@
       <w:pPr>
         <w:pStyle w:val="Heading3"/>
       </w:pPr>
-      <w:bookmarkStart w:id="39" w:name="_Toc242719269"/>
+      <w:bookmarkStart w:id="39" w:name="_Toc242721375"/>
       <w:r>
         <w:t>3.3.1 Reaso</w:t>
       </w:r>
@@ -10261,7 +10264,7 @@
       <w:pPr>
         <w:pStyle w:val="Heading3"/>
       </w:pPr>
-      <w:bookmarkStart w:id="40" w:name="_Toc242719270"/>
+      <w:bookmarkStart w:id="40" w:name="_Toc242721376"/>
       <w:r>
         <w:t>3.3.2 Application of the phases</w:t>
       </w:r>
@@ -11185,7 +11188,7 @@
       <w:pPr>
         <w:pStyle w:val="Heading3"/>
       </w:pPr>
-      <w:bookmarkStart w:id="41" w:name="_Toc242719271"/>
+      <w:bookmarkStart w:id="41" w:name="_Toc242721377"/>
       <w:r>
         <w:t>3.3.3 Limitation of the model</w:t>
       </w:r>
@@ -11206,7 +11209,7 @@
       <w:pPr>
         <w:pStyle w:val="Heading2"/>
       </w:pPr>
-      <w:bookmarkStart w:id="42" w:name="_Toc242719272"/>
+      <w:bookmarkStart w:id="42" w:name="_Toc242721378"/>
       <w:r>
         <w:t>3.4 Methods of Data Collection</w:t>
       </w:r>
@@ -11297,7 +11300,7 @@
       <w:pPr>
         <w:pStyle w:val="Heading2"/>
       </w:pPr>
-      <w:bookmarkStart w:id="43" w:name="_Toc242719273"/>
+      <w:bookmarkStart w:id="43" w:name="_Toc242721379"/>
       <w:r>
         <w:lastRenderedPageBreak/>
         <w:t>3.5 Analysis of the Existing</w:t>
@@ -11322,7 +11325,7 @@
       <w:pPr>
         <w:pStyle w:val="Heading3"/>
       </w:pPr>
-      <w:bookmarkStart w:id="44" w:name="_Toc242719274"/>
+      <w:bookmarkStart w:id="44" w:name="_Toc242721380"/>
       <w:r>
         <w:t>3.5.1 Problems of the existing system</w:t>
       </w:r>
@@ -11419,7 +11422,7 @@
       <w:pPr>
         <w:pStyle w:val="Heading2"/>
       </w:pPr>
-      <w:bookmarkStart w:id="45" w:name="_Toc242719275"/>
+      <w:bookmarkStart w:id="45" w:name="_Toc242721381"/>
       <w:r>
         <w:t>3.6 The Proposed System</w:t>
       </w:r>
@@ -11443,7 +11446,7 @@
       <w:pPr>
         <w:pStyle w:val="Heading3"/>
       </w:pPr>
-      <w:bookmarkStart w:id="46" w:name="_Toc242719276"/>
+      <w:bookmarkStart w:id="46" w:name="_Toc242721382"/>
       <w:r>
         <w:t>3.6.1 Advantages of the proposed syst</w:t>
       </w:r>
@@ -11544,7 +11547,7 @@
       <w:pPr>
         <w:pStyle w:val="Heading2"/>
       </w:pPr>
-      <w:bookmarkStart w:id="47" w:name="_Toc242719277"/>
+      <w:bookmarkStart w:id="47" w:name="_Toc242721383"/>
       <w:r>
         <w:t>3.7 Requirements Specification</w:t>
       </w:r>
@@ -11554,7 +11557,7 @@
       <w:pPr>
         <w:pStyle w:val="Heading3"/>
       </w:pPr>
-      <w:bookmarkStart w:id="48" w:name="_Toc242719278"/>
+      <w:bookmarkStart w:id="48" w:name="_Toc242721384"/>
       <w:r>
         <w:t>3.7.1 Users of the system</w:t>
       </w:r>
@@ -11930,7 +11933,7 @@
       <w:pPr>
         <w:pStyle w:val="Heading3"/>
       </w:pPr>
-      <w:bookmarkStart w:id="49" w:name="_Toc242719279"/>
+      <w:bookmarkStart w:id="49" w:name="_Toc242721385"/>
       <w:r>
         <w:t>3.7.2 Functional requirements</w:t>
       </w:r>
@@ -13489,7 +13492,7 @@
       <w:pPr>
         <w:pStyle w:val="Heading3"/>
       </w:pPr>
-      <w:bookmarkStart w:id="50" w:name="_Toc242719280"/>
+      <w:bookmarkStart w:id="50" w:name="_Toc242721386"/>
       <w:r>
         <w:t>3.7.3 Non-functional requirements</w:t>
       </w:r>
@@ -14131,7 +14134,7 @@
       <w:pPr>
         <w:pStyle w:val="Heading2"/>
       </w:pPr>
-      <w:bookmarkStart w:id="51" w:name="_Toc242719281"/>
+      <w:bookmarkStart w:id="51" w:name="_Toc242721387"/>
       <w:r>
         <w:t>3.8 Feasibility Study</w:t>
       </w:r>
@@ -14235,7 +14238,7 @@
       <w:pPr>
         <w:pStyle w:val="Heading2"/>
       </w:pPr>
-      <w:bookmarkStart w:id="52" w:name="_Toc242719282"/>
+      <w:bookmarkStart w:id="52" w:name="_Toc242721388"/>
       <w:r>
         <w:t>3.9 Development Tools and System Requirements</w:t>
       </w:r>
@@ -15620,7 +15623,7 @@
         <w:pageBreakBefore/>
         <w:jc w:val="center"/>
       </w:pPr>
-      <w:bookmarkStart w:id="53" w:name="_Toc242719283"/>
+      <w:bookmarkStart w:id="53" w:name="_Toc242721389"/>
       <w:r>
         <w:lastRenderedPageBreak/>
         <w:t>CHAPTER FOUR</w:t>
@@ -15635,7 +15638,7 @@
       <w:pPr>
         <w:pStyle w:val="Heading2"/>
       </w:pPr>
-      <w:bookmarkStart w:id="54" w:name="_Toc242719284"/>
+      <w:bookmarkStart w:id="54" w:name="_Toc242721390"/>
       <w:r>
         <w:t>4.1 Introduction</w:t>
       </w:r>
@@ -15656,7 +15659,7 @@
       <w:pPr>
         <w:pStyle w:val="Heading2"/>
       </w:pPr>
-      <w:bookmarkStart w:id="55" w:name="_Toc242719285"/>
+      <w:bookmarkStart w:id="55" w:name="_Toc242721391"/>
       <w:r>
         <w:t>4.2 System Architecture</w:t>
       </w:r>
@@ -15757,7 +15760,7 @@
       <w:pPr>
         <w:pStyle w:val="Heading2"/>
       </w:pPr>
-      <w:bookmarkStart w:id="56" w:name="_Toc242719286"/>
+      <w:bookmarkStart w:id="56" w:name="_Toc242721392"/>
       <w:r>
         <w:t>4.3 Use Case Diagram</w:t>
       </w:r>
@@ -16280,7 +16283,7 @@
       <w:pPr>
         <w:pStyle w:val="Heading2"/>
       </w:pPr>
-      <w:bookmarkStart w:id="57" w:name="_Toc242719287"/>
+      <w:bookmarkStart w:id="57" w:name="_Toc242721393"/>
       <w:r>
         <w:t>4.4 Data Flow Diagrams</w:t>
       </w:r>
@@ -16298,7 +16301,7 @@
       <w:pPr>
         <w:pStyle w:val="Heading3"/>
       </w:pPr>
-      <w:bookmarkStart w:id="58" w:name="_Toc242719288"/>
+      <w:bookmarkStart w:id="58" w:name="_Toc242721394"/>
       <w:r>
         <w:t>4.4.1 Context diagram (Level 0)</w:t>
       </w:r>
@@ -16382,7 +16385,7 @@
       <w:pPr>
         <w:pStyle w:val="Heading3"/>
       </w:pPr>
-      <w:bookmarkStart w:id="59" w:name="_Toc242719289"/>
+      <w:bookmarkStart w:id="59" w:name="_Toc242721395"/>
       <w:r>
         <w:t>4.4.2 Level 1 data flow diagram</w:t>
       </w:r>
@@ -16466,7 +16469,7 @@
       <w:pPr>
         <w:pStyle w:val="Heading2"/>
       </w:pPr>
-      <w:bookmarkStart w:id="60" w:name="_Toc242719290"/>
+      <w:bookmarkStart w:id="60" w:name="_Toc242721396"/>
       <w:r>
         <w:t>4.5 Databa</w:t>
       </w:r>
@@ -16479,7 +16482,7 @@
       <w:pPr>
         <w:pStyle w:val="Heading3"/>
       </w:pPr>
-      <w:bookmarkStart w:id="61" w:name="_Toc242719291"/>
+      <w:bookmarkStart w:id="61" w:name="_Toc242721397"/>
       <w:r>
         <w:t>4.5.1 Entity relationship diagram</w:t>
       </w:r>
@@ -16664,7 +16667,7 @@
       <w:pPr>
         <w:pStyle w:val="Heading3"/>
       </w:pPr>
-      <w:bookmarkStart w:id="62" w:name="_Toc242719292"/>
+      <w:bookmarkStart w:id="62" w:name="_Toc242721398"/>
       <w:r>
         <w:t>4.5.2 Normalisation</w:t>
       </w:r>
@@ -16692,7 +16695,7 @@
       <w:pPr>
         <w:pStyle w:val="Heading3"/>
       </w:pPr>
-      <w:bookmarkStart w:id="63" w:name="_Toc242719293"/>
+      <w:bookmarkStart w:id="63" w:name="_Toc242721399"/>
       <w:r>
         <w:t>4.5.3 Data dictionary</w:t>
       </w:r>
@@ -38855,7 +38858,7 @@
       <w:pPr>
         <w:pStyle w:val="Heading2"/>
       </w:pPr>
-      <w:bookmarkStart w:id="64" w:name="_Toc242719294"/>
+      <w:bookmarkStart w:id="64" w:name="_Toc242721400"/>
       <w:r>
         <w:t>4.6 Process Design: Booking Flowchart</w:t>
       </w:r>
@@ -38947,7 +38950,7 @@
       <w:pPr>
         <w:pStyle w:val="Heading2"/>
       </w:pPr>
-      <w:bookmarkStart w:id="65" w:name="_Toc242719295"/>
+      <w:bookmarkStart w:id="65" w:name="_Toc242721401"/>
       <w:r>
         <w:t>4.7 Interface Design</w:t>
       </w:r>
@@ -38957,7 +38960,7 @@
       <w:pPr>
         <w:pStyle w:val="Heading3"/>
       </w:pPr>
-      <w:bookmarkStart w:id="66" w:name="_Toc242719296"/>
+      <w:bookmarkStart w:id="66" w:name="_Toc242721402"/>
       <w:r>
         <w:t>4.7.1 Site structure</w:t>
       </w:r>
@@ -39044,7 +39047,7 @@
       <w:pPr>
         <w:pStyle w:val="Heading3"/>
       </w:pPr>
-      <w:bookmarkStart w:id="67" w:name="_Toc242719297"/>
+      <w:bookmarkStart w:id="67" w:name="_Toc242721403"/>
       <w:r>
         <w:t>4.7.2 Design principles</w:t>
       </w:r>
@@ -39172,7 +39175,7 @@
       <w:pPr>
         <w:pStyle w:val="Heading3"/>
       </w:pPr>
-      <w:bookmarkStart w:id="68" w:name="_Toc242719298"/>
+      <w:bookmarkStart w:id="68" w:name="_Toc242721404"/>
       <w:r>
         <w:lastRenderedPageBreak/>
         <w:t>4.7.3 Input and output design</w:t>
@@ -39197,7 +39200,7 @@
       <w:pPr>
         <w:pStyle w:val="Heading2"/>
       </w:pPr>
-      <w:bookmarkStart w:id="69" w:name="_Toc242719299"/>
+      <w:bookmarkStart w:id="69" w:name="_Toc242721405"/>
       <w:r>
         <w:t>4.8 Security Design</w:t>
       </w:r>
@@ -39911,7 +39914,7 @@
         <w:pageBreakBefore/>
         <w:jc w:val="center"/>
       </w:pPr>
-      <w:bookmarkStart w:id="70" w:name="_Toc242719300"/>
+      <w:bookmarkStart w:id="70" w:name="_Toc242721406"/>
       <w:r>
         <w:lastRenderedPageBreak/>
         <w:t>CHAPTER FIVE</w:t>
@@ -39926,7 +39929,7 @@
       <w:pPr>
         <w:pStyle w:val="Heading2"/>
       </w:pPr>
-      <w:bookmarkStart w:id="71" w:name="_Toc242719301"/>
+      <w:bookmarkStart w:id="71" w:name="_Toc242721407"/>
       <w:r>
         <w:t>5.1 Introduction</w:t>
       </w:r>
@@ -39947,7 +39950,7 @@
       <w:pPr>
         <w:pStyle w:val="Heading2"/>
       </w:pPr>
-      <w:bookmarkStart w:id="72" w:name="_Toc242719302"/>
+      <w:bookmarkStart w:id="72" w:name="_Toc242721408"/>
       <w:r>
         <w:t>5.2 Development Environment</w:t>
       </w:r>
@@ -39968,7 +39971,7 @@
       <w:pPr>
         <w:pStyle w:val="Heading2"/>
       </w:pPr>
-      <w:bookmarkStart w:id="73" w:name="_Toc242719303"/>
+      <w:bookmarkStart w:id="73" w:name="_Toc242721409"/>
       <w:r>
         <w:t>5.3 Structure of the Source Code</w:t>
       </w:r>
@@ -40677,7 +40680,7 @@
       <w:pPr>
         <w:pStyle w:val="Heading2"/>
       </w:pPr>
-      <w:bookmarkStart w:id="74" w:name="_Toc242719304"/>
+      <w:bookmarkStart w:id="74" w:name="_Toc242721410"/>
       <w:r>
         <w:t>5.4 Implementation of the Modules</w:t>
       </w:r>
@@ -40687,7 +40690,7 @@
       <w:pPr>
         <w:pStyle w:val="Heading3"/>
       </w:pPr>
-      <w:bookmarkStart w:id="75" w:name="_Toc242719305"/>
+      <w:bookmarkStart w:id="75" w:name="_Toc242721411"/>
       <w:r>
         <w:t>5.4.1 Public website</w:t>
       </w:r>
@@ -40701,7 +40704,10 @@
         <w:t>The home page (Figure 5.1) presents a hero section with a live search box, key statistics, featured destinations, tour packages, hotels, upcoming events and visitor reviews. Every heading, paragraph,</w:t>
       </w:r>
       <w:r>
-        <w:t xml:space="preserve"> button and link on the page is read from the database, so the administrator can change it at any time. Listing pages provide filters, and detail pages show full information with related items.</w:t>
+        <w:t xml:space="preserve"> button and link on the page is read from the database, so the administrator can change it at any time. Listing pages provide filters, and detail pages show full information with related items. Destinations, hotels and tour packages are illustrated with ph</w:t>
+      </w:r>
+      <w:r>
+        <w:t>otographs; the sample photographs supplied with the system are freely licensed images from Wikimedia Commons, and a Photo Credits page linked in the footer names the author and licence of each, as those licences require.</w:t>
       </w:r>
     </w:p>
     <w:p>
@@ -40714,9 +40720,10 @@
         <w:rPr>
           <w:noProof/>
         </w:rPr>
+        <w:lastRenderedPageBreak/>
         <w:drawing>
           <wp:inline distT="0" distB="0" distL="0" distR="0">
-            <wp:extent cx="4191000" cy="2524125"/>
+            <wp:extent cx="4191000" cy="4352925"/>
             <wp:effectExtent l="0" t="0" r="0" b="0"/>
             <wp:docPr id="9" name="01_home.jpg" descr="Figure 5.1: Home page" title="Figure 5.1: Home page"/>
             <wp:cNvGraphicFramePr>
@@ -40741,7 +40748,7 @@
                   <pic:spPr bwMode="auto">
                     <a:xfrm>
                       <a:off x="0" y="0"/>
-                      <a:ext cx="4191000" cy="2524125"/>
+                      <a:ext cx="4191000" cy="4352925"/>
                     </a:xfrm>
                     <a:prstGeom prst="rect">
                       <a:avLst/>
@@ -40773,7 +40780,7 @@
       <w:pPr>
         <w:pStyle w:val="Heading3"/>
       </w:pPr>
-      <w:bookmarkStart w:id="76" w:name="_Toc242719306"/>
+      <w:bookmarkStart w:id="76" w:name="_Toc242721412"/>
       <w:r>
         <w:t>5.4.2 Registration and authentication</w:t>
       </w:r>
@@ -40784,17 +40791,17 @@
         <w:jc w:val="both"/>
       </w:pPr>
       <w:r>
-        <w:t>Visitors register with their name, email address, telephone number, country and a password of at least eight characters. A single sign-in page serves all roles: after signing in, tourists are taken to their bookings and staff and administrators to the admi</w:t>
-      </w:r>
-      <w:r>
-        <w:t>nistration panel. Suspended accounts cannot sign in.</w:t>
+        <w:t>Visitors register with their name, email address, telephone number, country and a password of at least eight characters. A single sign-in page serves all roles: after signing in, tourists are taken to their bookings an</w:t>
+      </w:r>
+      <w:r>
+        <w:t>d staff and administrators to the administration panel. Suspended accounts cannot sign in.</w:t>
       </w:r>
     </w:p>
     <w:p>
       <w:pPr>
         <w:pStyle w:val="Heading3"/>
       </w:pPr>
-      <w:bookmarkStart w:id="77" w:name="_Toc242719307"/>
+      <w:bookmarkStart w:id="77" w:name="_Toc242721413"/>
       <w:r>
         <w:t>5.4.3 Booking and payment</w:t>
       </w:r>
@@ -40805,17 +40812,13 @@
         <w:jc w:val="both"/>
       </w:pPr>
       <w:r>
-        <w:t>A signed-in tourist books from the detail page of a package or hotel (Figure 5.2). JavaScript shows the total as the tourist types; the server recalculates it before saving. The</w:t>
-      </w:r>
-      <w:r>
-        <w:t xml:space="preserve"> tourist then </w:t>
-      </w:r>
-      <w:r>
-        <w:lastRenderedPageBreak/>
-        <w:t>chooses a payment method (Figure 5.3). Mobile money payments are recorded as paid with a generated transaction reference; cash payments remain pending until staff record that the cash was received. A receipt that can be printed is then displa</w:t>
-      </w:r>
-      <w:r>
-        <w:t>yed (Figure 5.4).</w:t>
+        <w:t>A signed-in tourist books from the detail page of a package or hotel (Figure 5.2). JavaScript shows the total as the tourist types; the ser</w:t>
+      </w:r>
+      <w:r>
+        <w:t>ver recalculates it before saving. The tourist then chooses a payment method (Figure 5.3). Mobile money payments are recorded as paid with a generated transaction reference; cash payments remain pending until staff record that the cash was received. A rece</w:t>
+      </w:r>
+      <w:r>
+        <w:t>ipt that can be printed is then displayed (Figure 5.4).</w:t>
       </w:r>
     </w:p>
     <w:p>
@@ -40828,6 +40831,7 @@
         <w:rPr>
           <w:noProof/>
         </w:rPr>
+        <w:lastRenderedPageBreak/>
         <w:drawing>
           <wp:inline distT="0" distB="0" distL="0" distR="0">
             <wp:extent cx="4191000" cy="2524125"/>
@@ -41018,7 +41022,7 @@
       <w:pPr>
         <w:pStyle w:val="Heading3"/>
       </w:pPr>
-      <w:bookmarkStart w:id="78" w:name="_Toc242719308"/>
+      <w:bookmarkStart w:id="78" w:name="_Toc242721414"/>
       <w:r>
         <w:t>5.4.4 Tourist dashboard</w:t>
       </w:r>
@@ -41104,7 +41108,7 @@
       <w:pPr>
         <w:pStyle w:val="Heading3"/>
       </w:pPr>
-      <w:bookmarkStart w:id="79" w:name="_Toc242719309"/>
+      <w:bookmarkStart w:id="79" w:name="_Toc242721415"/>
       <w:r>
         <w:t>5.4.5 Administration dashboard</w:t>
       </w:r>
@@ -41203,7 +41207,7 @@
       <w:pPr>
         <w:pStyle w:val="Heading3"/>
       </w:pPr>
-      <w:bookmarkStart w:id="80" w:name="_Toc242719310"/>
+      <w:bookmarkStart w:id="80" w:name="_Toc242721416"/>
       <w:r>
         <w:t>5.4.6 Management of tourism content</w:t>
       </w:r>
@@ -41289,7 +41293,7 @@
       <w:pPr>
         <w:pStyle w:val="Heading3"/>
       </w:pPr>
-      <w:bookmarkStart w:id="81" w:name="_Toc242719311"/>
+      <w:bookmarkStart w:id="81" w:name="_Toc242721417"/>
       <w:r>
         <w:lastRenderedPageBreak/>
         <w:t>5.4.7 Management of bookings</w:t>
@@ -41376,7 +41380,7 @@
       <w:pPr>
         <w:pStyle w:val="Heading3"/>
       </w:pPr>
-      <w:bookmarkStart w:id="82" w:name="_Toc242719312"/>
+      <w:bookmarkStart w:id="82" w:name="_Toc242721418"/>
       <w:r>
         <w:t>5.4.8 Content management</w:t>
       </w:r>
@@ -41472,7 +41476,7 @@
       <w:pPr>
         <w:pStyle w:val="Heading3"/>
       </w:pPr>
-      <w:bookmarkStart w:id="83" w:name="_Toc242719313"/>
+      <w:bookmarkStart w:id="83" w:name="_Toc242721419"/>
       <w:r>
         <w:t>5.4.9 User accounts and roles</w:t>
       </w:r>
@@ -41558,7 +41562,7 @@
       <w:pPr>
         <w:pStyle w:val="Heading3"/>
       </w:pPr>
-      <w:bookmarkStart w:id="84" w:name="_Toc242719314"/>
+      <w:bookmarkStart w:id="84" w:name="_Toc242721420"/>
       <w:r>
         <w:t>5.4.10 Reports</w:t>
       </w:r>
@@ -41651,7 +41655,7 @@
       <w:pPr>
         <w:pStyle w:val="Heading2"/>
       </w:pPr>
-      <w:bookmarkStart w:id="85" w:name="_Toc242719315"/>
+      <w:bookmarkStart w:id="85" w:name="_Toc242721421"/>
       <w:r>
         <w:t>5.5 Sample Source Code</w:t>
       </w:r>
@@ -41669,7 +41673,7 @@
       <w:pPr>
         <w:pStyle w:val="Heading3"/>
       </w:pPr>
-      <w:bookmarkStart w:id="86" w:name="_Toc242719316"/>
+      <w:bookmarkStart w:id="86" w:name="_Toc242721422"/>
       <w:r>
         <w:t>5.5.1 Database access with prepared statements</w:t>
       </w:r>
@@ -41814,7 +41818,7 @@
       <w:pPr>
         <w:pStyle w:val="Heading3"/>
       </w:pPr>
-      <w:bookmarkStart w:id="87" w:name="_Toc242719317"/>
+      <w:bookmarkStart w:id="87" w:name="_Toc242721423"/>
       <w:r>
         <w:t>5.5.2 Sign-in with password verification</w:t>
       </w:r>
@@ -41975,7 +41979,7 @@
       <w:pPr>
         <w:pStyle w:val="Heading3"/>
       </w:pPr>
-      <w:bookmarkStart w:id="88" w:name="_Toc242719318"/>
+      <w:bookmarkStart w:id="88" w:name="_Toc242721424"/>
       <w:r>
         <w:lastRenderedPageBreak/>
         <w:t>5.5.3 Role-based access control</w:t>
@@ -42153,7 +42157,7 @@
       <w:pPr>
         <w:pStyle w:val="Heading3"/>
       </w:pPr>
-      <w:bookmarkStart w:id="89" w:name="_Toc242719319"/>
+      <w:bookmarkStart w:id="89" w:name="_Toc242721425"/>
       <w:r>
         <w:t>5.5.4 Live search with the fetch API (JavaScri</w:t>
       </w:r>
@@ -42357,7 +42361,7 @@
       <w:pPr>
         <w:pStyle w:val="Heading2"/>
       </w:pPr>
-      <w:bookmarkStart w:id="90" w:name="_Toc242719320"/>
+      <w:bookmarkStart w:id="90" w:name="_Toc242721426"/>
       <w:r>
         <w:t>5.6 System Testing</w:t>
       </w:r>
@@ -42367,7 +42371,7 @@
       <w:pPr>
         <w:pStyle w:val="Heading3"/>
       </w:pPr>
-      <w:bookmarkStart w:id="91" w:name="_Toc242719321"/>
+      <w:bookmarkStart w:id="91" w:name="_Toc242721427"/>
       <w:r>
         <w:t>5.6.1 Testing strategy</w:t>
       </w:r>
@@ -42495,7 +42499,7 @@
       <w:pPr>
         <w:pStyle w:val="Heading3"/>
       </w:pPr>
-      <w:bookmarkStart w:id="92" w:name="_Toc242719322"/>
+      <w:bookmarkStart w:id="92" w:name="_Toc242721428"/>
       <w:r>
         <w:lastRenderedPageBreak/>
         <w:t>5.6.2 Test cases and results</w:t>
@@ -45726,7 +45730,7 @@
       <w:pPr>
         <w:pStyle w:val="Heading3"/>
       </w:pPr>
-      <w:bookmarkStart w:id="93" w:name="_Toc242719323"/>
+      <w:bookmarkStart w:id="93" w:name="_Toc242721429"/>
       <w:r>
         <w:t>5.6.3 Discussion of results</w:t>
       </w:r>
@@ -45750,7 +45754,7 @@
       <w:pPr>
         <w:pStyle w:val="Heading2"/>
       </w:pPr>
-      <w:bookmarkStart w:id="94" w:name="_Toc242719324"/>
+      <w:bookmarkStart w:id="94" w:name="_Toc242721430"/>
       <w:r>
         <w:t>5.7 System Deployment</w:t>
       </w:r>
@@ -45852,7 +45856,7 @@
       <w:pPr>
         <w:pStyle w:val="Heading2"/>
       </w:pPr>
-      <w:bookmarkStart w:id="95" w:name="_Toc242719325"/>
+      <w:bookmarkStart w:id="95" w:name="_Toc242721431"/>
       <w:r>
         <w:lastRenderedPageBreak/>
         <w:t>5.8 Maintenance</w:t>
@@ -45955,7 +45959,7 @@
         <w:pageBreakBefore/>
         <w:jc w:val="center"/>
       </w:pPr>
-      <w:bookmarkStart w:id="96" w:name="_Toc242719326"/>
+      <w:bookmarkStart w:id="96" w:name="_Toc242721432"/>
       <w:r>
         <w:lastRenderedPageBreak/>
         <w:t>CHAPTER SIX</w:t>
@@ -45970,7 +45974,7 @@
       <w:pPr>
         <w:pStyle w:val="Heading2"/>
       </w:pPr>
-      <w:bookmarkStart w:id="97" w:name="_Toc242719327"/>
+      <w:bookmarkStart w:id="97" w:name="_Toc242721433"/>
       <w:r>
         <w:t>6.1 Introduction</w:t>
       </w:r>
@@ -45991,7 +45995,7 @@
       <w:pPr>
         <w:pStyle w:val="Heading2"/>
       </w:pPr>
-      <w:bookmarkStart w:id="98" w:name="_Toc242719328"/>
+      <w:bookmarkStart w:id="98" w:name="_Toc242721434"/>
       <w:r>
         <w:t>6.2 Summary of the Study</w:t>
       </w:r>
@@ -46018,7 +46022,7 @@
       <w:pPr>
         <w:pStyle w:val="Heading2"/>
       </w:pPr>
-      <w:bookmarkStart w:id="99" w:name="_Toc242719329"/>
+      <w:bookmarkStart w:id="99" w:name="_Toc242721435"/>
       <w:r>
         <w:t>6.3 Achievement of the Objectives</w:t>
       </w:r>
@@ -46661,7 +46665,7 @@
       <w:pPr>
         <w:pStyle w:val="Heading2"/>
       </w:pPr>
-      <w:bookmarkStart w:id="100" w:name="_Toc242719330"/>
+      <w:bookmarkStart w:id="100" w:name="_Toc242721436"/>
       <w:r>
         <w:t>6.4 Challenges Encountered</w:t>
       </w:r>
@@ -46706,10 +46710,10 @@
         <w:jc w:val="both"/>
       </w:pPr>
       <w:r>
-        <w:t>P</w:t>
-      </w:r>
-      <w:r>
-        <w:t>hotographs of attractions with permission for reuse were not available at the time of development; the system displays a placeholder until a photograph is uploaded.</w:t>
+        <w:t>F</w:t>
+      </w:r>
+      <w:r>
+        <w:t>reely licensed photographs could be found for ten of the twelve sample destinations but for none of the hotels. The hotels are therefore illustrated with scenery of their area, and the system displays a placeholder wherever no photograph has been uploaded.</w:t>
       </w:r>
     </w:p>
     <w:p>
@@ -46723,17 +46727,14 @@
         <w:jc w:val="both"/>
       </w:pPr>
       <w:r>
-        <w:t>Designing one administration screen that serves many different tables required careful plan</w:t>
-      </w:r>
-      <w:r>
-        <w:t>ning but greatly reduced the amount of code.</w:t>
+        <w:t>Designing one administration screen that serves many different tables required careful planning but greatly reduced the amount of code.</w:t>
       </w:r>
     </w:p>
     <w:p>
       <w:pPr>
         <w:pStyle w:val="Heading2"/>
       </w:pPr>
-      <w:bookmarkStart w:id="101" w:name="_Toc242719331"/>
+      <w:bookmarkStart w:id="101" w:name="_Toc242721437"/>
       <w:r>
         <w:t>6.5 Conclusion</w:t>
       </w:r>
@@ -46744,24 +46745,25 @@
         <w:jc w:val="both"/>
       </w:pPr>
       <w:r>
-        <w:t>The study has shown that the problems of scattered information, slow manual booking, unreliable records and the absence of reports can be addressed with a web-based system built entirely from free</w:t>
-      </w:r>
-      <w:r>
-        <w:t>, widely available technologies. The Tourism Management System developed provides a single source of information on Liberia’s attractions, allows tourists to book and pay from any device, gives staff simple tools to keep information current, lets the admin</w:t>
-      </w:r>
-      <w:r>
-        <w:t>istrator control users and all site content, and produces management reports on demand. The system met all its stated requirements when tested. If adopted and kept up to date, it can make Liberia easier to discover and to visit, and can give those responsi</w:t>
-      </w:r>
-      <w:r>
-        <w:t>ble for tourism the information they need to plan.</w:t>
+        <w:t xml:space="preserve">The study has shown that the problems of scattered information, slow manual booking, unreliable records </w:t>
+      </w:r>
+      <w:r>
+        <w:t>and the absence of reports can be addressed with a web-based system built entirely from free, widely available technologies. The Tourism Management System developed provides a single source of information on Liberia’s attractions, allows tourists to book a</w:t>
+      </w:r>
+      <w:r>
+        <w:t xml:space="preserve">nd pay from any device, gives staff simple tools to keep information current, lets the administrator control users and all site content, and produces management reports on demand. The system met all its stated requirements when tested. If adopted and kept </w:t>
+      </w:r>
+      <w:r>
+        <w:t>up to date, it can make Liberia easier to discover and to visit, and can give those responsible for tourism the information they need to plan.</w:t>
       </w:r>
     </w:p>
     <w:p>
       <w:pPr>
         <w:pStyle w:val="Heading2"/>
       </w:pPr>
-      <w:bookmarkStart w:id="102" w:name="_Toc242719332"/>
-      <w:r>
+      <w:bookmarkStart w:id="102" w:name="_Toc242721438"/>
+      <w:r>
+        <w:lastRenderedPageBreak/>
         <w:t>6.6 Recommendations</w:t>
       </w:r>
       <w:bookmarkEnd w:id="102"/>
@@ -46777,7 +46779,10 @@
         <w:jc w:val="both"/>
       </w:pPr>
       <w:r>
-        <w:t>The Ministry responsible for tourism, or another suitable body, should consider adopting the system and assigning staff to keep its content current.</w:t>
+        <w:t xml:space="preserve">The Ministry responsible for tourism, or another suitable body, should consider adopting the </w:t>
+      </w:r>
+      <w:r>
+        <w:t>system and assigning staff to keep its content current.</w:t>
       </w:r>
     </w:p>
     <w:p>
@@ -46791,11 +46796,7 @@
         <w:jc w:val="both"/>
       </w:pPr>
       <w:r>
-        <w:lastRenderedPageBreak/>
-        <w:t>The system should be hosted on a pub</w:t>
-      </w:r>
-      <w:r>
-        <w:t>lic server with HTTPS and a registered domain name so that it is reachable worldwide.</w:t>
+        <w:t>The system should be hosted on a public server with HTTPS and a registered domain name so that it is reachable worldwide.</w:t>
       </w:r>
     </w:p>
     <w:p>
@@ -46809,7 +46810,10 @@
         <w:jc w:val="both"/>
       </w:pPr>
       <w:r>
-        <w:t>Real photographs and verified details of destinations, hotels and guides should be entered before public launch.</w:t>
+        <w:t>The sample photographs and details should be replaced with the tourism authori</w:t>
+      </w:r>
+      <w:r>
+        <w:t>ty’s own photographs and verified details of destinations, hotels and guides before public launch.</w:t>
       </w:r>
     </w:p>
     <w:p>
@@ -46823,10 +46827,7 @@
         <w:jc w:val="both"/>
       </w:pPr>
       <w:r>
-        <w:t>Acceptance testing should be carried out with tourists, h</w:t>
-      </w:r>
-      <w:r>
-        <w:t>otel operators, guides and tourism officers, and their feedback used to refine the system.</w:t>
+        <w:t>Acceptance testing should be carried out with tourists, hotel operators, guides and tourism officers, and their feedback used to refine the system.</w:t>
       </w:r>
     </w:p>
     <w:p>
@@ -46840,7 +46841,10 @@
         <w:jc w:val="both"/>
       </w:pPr>
       <w:r>
-        <w:t>The database and uploaded files should be backed up regularly.</w:t>
+        <w:t>The datab</w:t>
+      </w:r>
+      <w:r>
+        <w:t>ase and uploaded files should be backed up regularly.</w:t>
       </w:r>
     </w:p>
     <w:p>
@@ -46861,12 +46865,9 @@
       <w:pPr>
         <w:pStyle w:val="Heading2"/>
       </w:pPr>
-      <w:bookmarkStart w:id="103" w:name="_Toc242719333"/>
-      <w:r>
-        <w:t>6.7 Suggestions for Fu</w:t>
-      </w:r>
-      <w:r>
-        <w:t>rther Work</w:t>
+      <w:bookmarkStart w:id="103" w:name="_Toc242721439"/>
+      <w:r>
+        <w:t>6.7 Suggestions for Further Work</w:t>
       </w:r>
       <w:bookmarkEnd w:id="103"/>
     </w:p>
@@ -46881,7 +46882,10 @@
         <w:jc w:val="both"/>
       </w:pPr>
       <w:r>
-        <w:t>Integration with live MTN Mobile Money and Orange Money payment services, and with card payments.</w:t>
+        <w:t>Integration with live MTN Mobile Money and Orange Money payment services, and with card p</w:t>
+      </w:r>
+      <w:r>
+        <w:t>ayments.</w:t>
       </w:r>
     </w:p>
     <w:p>
@@ -46923,10 +46927,7 @@
         <w:jc w:val="both"/>
       </w:pPr>
       <w:r>
-        <w:t xml:space="preserve">Accounts </w:t>
-      </w:r>
-      <w:r>
-        <w:t>for hotel owners and tour operators so that they can manage their own listings and availability.</w:t>
+        <w:t>Accounts for hotel owners and tour operators so that they can manage their own listings and availability.</w:t>
       </w:r>
     </w:p>
     <w:p>
@@ -46940,7 +46941,10 @@
         <w:jc w:val="both"/>
       </w:pPr>
       <w:r>
-        <w:t>Support for additional languages, such as French, for visitors from neighbouring countries.</w:t>
+        <w:t>Sup</w:t>
+      </w:r>
+      <w:r>
+        <w:t>port for additional languages, such as French, for visitors from neighbouring countries.</w:t>
       </w:r>
     </w:p>
     <w:p>
@@ -46954,10 +46958,7 @@
         <w:jc w:val="both"/>
       </w:pPr>
       <w:r>
-        <w:t>A mobile application or installable progressive web application wit</w:t>
-      </w:r>
-      <w:r>
-        <w:t>h offline access to saved trips.</w:t>
+        <w:t>A mobile application or installable progressive web application with offline access to saved trips.</w:t>
       </w:r>
     </w:p>
     <w:p>
@@ -46980,7 +46981,7 @@
         <w:pageBreakBefore/>
         <w:jc w:val="center"/>
       </w:pPr>
-      <w:bookmarkStart w:id="104" w:name="_Toc242719334"/>
+      <w:bookmarkStart w:id="104" w:name="_Toc242721440"/>
       <w:r>
         <w:lastRenderedPageBreak/>
         <w:t>REFERENCES</w:t>
@@ -47156,7 +47157,7 @@
         <w:pageBreakBefore/>
         <w:jc w:val="center"/>
       </w:pPr>
-      <w:bookmarkStart w:id="105" w:name="_Toc242719335"/>
+      <w:bookmarkStart w:id="105" w:name="_Toc242721441"/>
       <w:r>
         <w:lastRenderedPageBreak/>
         <w:t>APPENDIX A: USER GUIDE</w:t>
@@ -47167,7 +47168,7 @@
       <w:pPr>
         <w:pStyle w:val="Heading2"/>
       </w:pPr>
-      <w:bookmarkStart w:id="106" w:name="_Toc242719336"/>
+      <w:bookmarkStart w:id="106" w:name="_Toc242721442"/>
       <w:r>
         <w:t>A.1 For tourists</w:t>
       </w:r>
@@ -47267,7 +47268,7 @@
       <w:pPr>
         <w:pStyle w:val="Heading2"/>
       </w:pPr>
-      <w:bookmarkStart w:id="107" w:name="_Toc242719337"/>
+      <w:bookmarkStart w:id="107" w:name="_Toc242721443"/>
       <w:r>
         <w:t>A.2 For staff</w:t>
       </w:r>
@@ -47350,7 +47351,7 @@
       <w:pPr>
         <w:pStyle w:val="Heading2"/>
       </w:pPr>
-      <w:bookmarkStart w:id="108" w:name="_Toc242719338"/>
+      <w:bookmarkStart w:id="108" w:name="_Toc242721444"/>
       <w:r>
         <w:t>A.3 For the administrator</w:t>
       </w:r>
@@ -47424,7 +47425,7 @@
         <w:pageBreakBefore/>
         <w:jc w:val="center"/>
       </w:pPr>
-      <w:bookmarkStart w:id="109" w:name="_Toc242719339"/>
+      <w:bookmarkStart w:id="109" w:name="_Toc242721445"/>
       <w:r>
         <w:lastRenderedPageBreak/>
         <w:t>APPENDIX B: SOURCE CODE AND DATABASE SCRIPT</w:t>
@@ -47566,7 +47567,7 @@
         <w:sz w:val="22"/>
         <w:szCs w:val="22"/>
       </w:rPr>
-      <w:t>51</w:t>
+      <w:t>52</w:t>
     </w:r>
     <w:r>
       <w:rPr>
@@ -47607,10 +47608,10 @@
 <file path=word/numbering.xml><?xml version="1.0" encoding="utf-8"?>
 <w:numbering xmlns:wpc="http://schemas.microsoft.com/office/word/2010/wordprocessingCanvas" xmlns:cx="http://schemas.microsoft.com/office/drawing/2014/chartex" xmlns:cx1="http://schemas.microsoft.com/office/drawing/2015/9/8/chartex" xmlns:mc="http://schemas.openxmlformats.org/markup-compatibility/2006" xmlns:o="urn:schemas-microsoft-com:office:office" xmlns:r="http://schemas.openxmlformats.org/officeDocument/2006/relationships" xmlns:m="http://schemas.openxmlformats.org/officeDocument/2006/math" xmlns:v="urn:schemas-microsoft-com:vml" xmlns:wp14="http://schemas.microsoft.com/office/word/2010/wordprocessingDrawing" xmlns:wp="http://schemas.openxmlformats.org/drawingml/2006/wordprocessingDrawing" xmlns:w10="urn:schemas-microsoft-com:office:word" xmlns:w="http://schemas.openxmlformats.org/wordprocessingml/2006/main" xmlns:w14="http://schemas.microsoft.com/office/word/2010/wordml" xmlns:w15="http://schemas.microsoft.com/office/word/2012/wordml" xmlns:w16se="http://schemas.microsoft.com/office/word/2015/wordml/symex" xmlns:wpg="http://schemas.microsoft.com/office/word/2010/wordprocessingGroup" xmlns:wpi="http://schemas.microsoft.com/office/word/2010/wordprocessingInk" xmlns:wne="http://schemas.microsoft.com/office/word/2006/wordml" xmlns:wps="http://schemas.microsoft.com/office/word/2010/wordprocessingShape" mc:Ignorable="w14 w15 w16se wp14">
   <w:abstractNum w:abstractNumId="0" w15:restartNumberingAfterBreak="0">
-    <w:nsid w:val="07962EFF"/>
+    <w:nsid w:val="260D6A09"/>
     <w:multiLevelType w:val="hybridMultilevel"/>
-    <w:tmpl w:val="6A363A1A"/>
-    <w:lvl w:ilvl="0" w:tplc="63067598">
+    <w:tmpl w:val="50D6749C"/>
+    <w:lvl w:ilvl="0" w:tplc="FA1EF616">
       <w:start w:val="1"/>
       <w:numFmt w:val="decimal"/>
       <w:lvlText w:val="%1."/>
@@ -47619,52 +47620,52 @@
         <w:ind w:left="720" w:hanging="360"/>
       </w:pPr>
     </w:lvl>
-    <w:lvl w:ilvl="1" w:tplc="E4FA1106">
+    <w:lvl w:ilvl="1" w:tplc="3F841408">
       <w:numFmt w:val="decimal"/>
       <w:lvlText w:val=""/>
       <w:lvlJc w:val="left"/>
     </w:lvl>
-    <w:lvl w:ilvl="2" w:tplc="8FAE9FB8">
+    <w:lvl w:ilvl="2" w:tplc="B93E396E">
       <w:numFmt w:val="decimal"/>
       <w:lvlText w:val=""/>
       <w:lvlJc w:val="left"/>
     </w:lvl>
-    <w:lvl w:ilvl="3" w:tplc="E6AE415A">
+    <w:lvl w:ilvl="3" w:tplc="A95A6C8A">
       <w:numFmt w:val="decimal"/>
       <w:lvlText w:val=""/>
       <w:lvlJc w:val="left"/>
     </w:lvl>
-    <w:lvl w:ilvl="4" w:tplc="9DE020D8">
+    <w:lvl w:ilvl="4" w:tplc="4774A52A">
       <w:numFmt w:val="decimal"/>
       <w:lvlText w:val=""/>
       <w:lvlJc w:val="left"/>
     </w:lvl>
-    <w:lvl w:ilvl="5" w:tplc="448290B4">
+    <w:lvl w:ilvl="5" w:tplc="D2E40A46">
       <w:numFmt w:val="decimal"/>
       <w:lvlText w:val=""/>
       <w:lvlJc w:val="left"/>
     </w:lvl>
-    <w:lvl w:ilvl="6" w:tplc="E790FC0A">
+    <w:lvl w:ilvl="6" w:tplc="77A801BC">
       <w:numFmt w:val="decimal"/>
       <w:lvlText w:val=""/>
       <w:lvlJc w:val="left"/>
     </w:lvl>
-    <w:lvl w:ilvl="7" w:tplc="B7E8C86A">
+    <w:lvl w:ilvl="7" w:tplc="DA3842FC">
       <w:numFmt w:val="decimal"/>
       <w:lvlText w:val=""/>
       <w:lvlJc w:val="left"/>
     </w:lvl>
-    <w:lvl w:ilvl="8" w:tplc="276A8A56">
+    <w:lvl w:ilvl="8" w:tplc="186C34A8">
       <w:numFmt w:val="decimal"/>
       <w:lvlText w:val=""/>
       <w:lvlJc w:val="left"/>
     </w:lvl>
   </w:abstractNum>
   <w:abstractNum w:abstractNumId="1" w15:restartNumberingAfterBreak="0">
-    <w:nsid w:val="15191ABB"/>
+    <w:nsid w:val="27A93709"/>
     <w:multiLevelType w:val="hybridMultilevel"/>
-    <w:tmpl w:val="805CDCF8"/>
-    <w:lvl w:ilvl="0" w:tplc="C876E80E">
+    <w:tmpl w:val="31807B32"/>
+    <w:lvl w:ilvl="0" w:tplc="A0B6D432">
       <w:start w:val="1"/>
       <w:numFmt w:val="decimal"/>
       <w:lvlText w:val="%1."/>
@@ -47673,52 +47674,52 @@
         <w:ind w:left="720" w:hanging="360"/>
       </w:pPr>
     </w:lvl>
-    <w:lvl w:ilvl="1" w:tplc="0ADE26D0">
+    <w:lvl w:ilvl="1" w:tplc="FD566FDC">
       <w:numFmt w:val="decimal"/>
       <w:lvlText w:val=""/>
       <w:lvlJc w:val="left"/>
     </w:lvl>
-    <w:lvl w:ilvl="2" w:tplc="655049BC">
+    <w:lvl w:ilvl="2" w:tplc="C41E33E2">
       <w:numFmt w:val="decimal"/>
       <w:lvlText w:val=""/>
       <w:lvlJc w:val="left"/>
     </w:lvl>
-    <w:lvl w:ilvl="3" w:tplc="11100340">
+    <w:lvl w:ilvl="3" w:tplc="EE167B22">
       <w:numFmt w:val="decimal"/>
       <w:lvlText w:val=""/>
       <w:lvlJc w:val="left"/>
     </w:lvl>
-    <w:lvl w:ilvl="4" w:tplc="2CA883E6">
+    <w:lvl w:ilvl="4" w:tplc="638A071C">
       <w:numFmt w:val="decimal"/>
       <w:lvlText w:val=""/>
       <w:lvlJc w:val="left"/>
     </w:lvl>
-    <w:lvl w:ilvl="5" w:tplc="83E0A77A">
+    <w:lvl w:ilvl="5" w:tplc="1D1639B4">
       <w:numFmt w:val="decimal"/>
       <w:lvlText w:val=""/>
       <w:lvlJc w:val="left"/>
     </w:lvl>
-    <w:lvl w:ilvl="6" w:tplc="951E2B88">
+    <w:lvl w:ilvl="6" w:tplc="FA88EC38">
       <w:numFmt w:val="decimal"/>
       <w:lvlText w:val=""/>
       <w:lvlJc w:val="left"/>
     </w:lvl>
-    <w:lvl w:ilvl="7" w:tplc="6406AB22">
+    <w:lvl w:ilvl="7" w:tplc="D438271C">
       <w:numFmt w:val="decimal"/>
       <w:lvlText w:val=""/>
       <w:lvlJc w:val="left"/>
     </w:lvl>
-    <w:lvl w:ilvl="8" w:tplc="C4EC08DA">
+    <w:lvl w:ilvl="8" w:tplc="A5B23C46">
       <w:numFmt w:val="decimal"/>
       <w:lvlText w:val=""/>
       <w:lvlJc w:val="left"/>
     </w:lvl>
   </w:abstractNum>
   <w:abstractNum w:abstractNumId="2" w15:restartNumberingAfterBreak="0">
-    <w:nsid w:val="152D18C4"/>
+    <w:nsid w:val="42765D77"/>
     <w:multiLevelType w:val="hybridMultilevel"/>
-    <w:tmpl w:val="880491CE"/>
-    <w:lvl w:ilvl="0" w:tplc="FFFC1130">
+    <w:tmpl w:val="EA58E754"/>
+    <w:lvl w:ilvl="0" w:tplc="10FCE5A6">
       <w:start w:val="1"/>
       <w:numFmt w:val="decimal"/>
       <w:lvlText w:val="%1."/>
@@ -47727,214 +47728,52 @@
         <w:ind w:left="720" w:hanging="360"/>
       </w:pPr>
     </w:lvl>
-    <w:lvl w:ilvl="1" w:tplc="CEF2B9A8">
+    <w:lvl w:ilvl="1" w:tplc="ACE2D264">
       <w:numFmt w:val="decimal"/>
       <w:lvlText w:val=""/>
       <w:lvlJc w:val="left"/>
     </w:lvl>
-    <w:lvl w:ilvl="2" w:tplc="E0A80BD6">
+    <w:lvl w:ilvl="2" w:tplc="DFDE0382">
       <w:numFmt w:val="decimal"/>
       <w:lvlText w:val=""/>
       <w:lvlJc w:val="left"/>
     </w:lvl>
-    <w:lvl w:ilvl="3" w:tplc="72049224">
+    <w:lvl w:ilvl="3" w:tplc="02ACCC6E">
       <w:numFmt w:val="decimal"/>
       <w:lvlText w:val=""/>
       <w:lvlJc w:val="left"/>
     </w:lvl>
-    <w:lvl w:ilvl="4" w:tplc="069A9D48">
+    <w:lvl w:ilvl="4" w:tplc="4BC07D64">
       <w:numFmt w:val="decimal"/>
       <w:lvlText w:val=""/>
       <w:lvlJc w:val="left"/>
     </w:lvl>
-    <w:lvl w:ilvl="5" w:tplc="4B8235AA">
+    <w:lvl w:ilvl="5" w:tplc="D16A89A8">
       <w:numFmt w:val="decimal"/>
       <w:lvlText w:val=""/>
       <w:lvlJc w:val="left"/>
     </w:lvl>
-    <w:lvl w:ilvl="6" w:tplc="26C48530">
+    <w:lvl w:ilvl="6" w:tplc="62CCA6E4">
       <w:numFmt w:val="decimal"/>
       <w:lvlText w:val=""/>
       <w:lvlJc w:val="left"/>
     </w:lvl>
-    <w:lvl w:ilvl="7" w:tplc="20B64C60">
+    <w:lvl w:ilvl="7" w:tplc="00F0608C">
       <w:numFmt w:val="decimal"/>
       <w:lvlText w:val=""/>
       <w:lvlJc w:val="left"/>
     </w:lvl>
-    <w:lvl w:ilvl="8" w:tplc="6D34EB86">
+    <w:lvl w:ilvl="8" w:tplc="58D66F14">
       <w:numFmt w:val="decimal"/>
       <w:lvlText w:val=""/>
       <w:lvlJc w:val="left"/>
     </w:lvl>
   </w:abstractNum>
   <w:abstractNum w:abstractNumId="3" w15:restartNumberingAfterBreak="0">
-    <w:nsid w:val="33AA354F"/>
+    <w:nsid w:val="45F165A4"/>
     <w:multiLevelType w:val="hybridMultilevel"/>
-    <w:tmpl w:val="A47A4DC6"/>
-    <w:lvl w:ilvl="0" w:tplc="2A00CA90">
-      <w:start w:val="1"/>
-      <w:numFmt w:val="decimal"/>
-      <w:lvlText w:val="%1."/>
-      <w:lvlJc w:val="left"/>
-      <w:pPr>
-        <w:ind w:left="720" w:hanging="360"/>
-      </w:pPr>
-    </w:lvl>
-    <w:lvl w:ilvl="1" w:tplc="846A631E">
-      <w:numFmt w:val="decimal"/>
-      <w:lvlText w:val=""/>
-      <w:lvlJc w:val="left"/>
-    </w:lvl>
-    <w:lvl w:ilvl="2" w:tplc="D69CE166">
-      <w:numFmt w:val="decimal"/>
-      <w:lvlText w:val=""/>
-      <w:lvlJc w:val="left"/>
-    </w:lvl>
-    <w:lvl w:ilvl="3" w:tplc="922622D4">
-      <w:numFmt w:val="decimal"/>
-      <w:lvlText w:val=""/>
-      <w:lvlJc w:val="left"/>
-    </w:lvl>
-    <w:lvl w:ilvl="4" w:tplc="7A1AC1CA">
-      <w:numFmt w:val="decimal"/>
-      <w:lvlText w:val=""/>
-      <w:lvlJc w:val="left"/>
-    </w:lvl>
-    <w:lvl w:ilvl="5" w:tplc="E3BA13E6">
-      <w:numFmt w:val="decimal"/>
-      <w:lvlText w:val=""/>
-      <w:lvlJc w:val="left"/>
-    </w:lvl>
-    <w:lvl w:ilvl="6" w:tplc="B22E46EC">
-      <w:numFmt w:val="decimal"/>
-      <w:lvlText w:val=""/>
-      <w:lvlJc w:val="left"/>
-    </w:lvl>
-    <w:lvl w:ilvl="7" w:tplc="33ACC7EA">
-      <w:numFmt w:val="decimal"/>
-      <w:lvlText w:val=""/>
-      <w:lvlJc w:val="left"/>
-    </w:lvl>
-    <w:lvl w:ilvl="8" w:tplc="EE4804E6">
-      <w:numFmt w:val="decimal"/>
-      <w:lvlText w:val=""/>
-      <w:lvlJc w:val="left"/>
-    </w:lvl>
-  </w:abstractNum>
-  <w:abstractNum w:abstractNumId="4" w15:restartNumberingAfterBreak="0">
-    <w:nsid w:val="3B6016C4"/>
-    <w:multiLevelType w:val="hybridMultilevel"/>
-    <w:tmpl w:val="47BC54E4"/>
-    <w:lvl w:ilvl="0" w:tplc="13DC33C6">
-      <w:start w:val="1"/>
-      <w:numFmt w:val="decimal"/>
-      <w:lvlText w:val="%1."/>
-      <w:lvlJc w:val="left"/>
-      <w:pPr>
-        <w:ind w:left="720" w:hanging="360"/>
-      </w:pPr>
-    </w:lvl>
-    <w:lvl w:ilvl="1" w:tplc="7B9CA016">
-      <w:numFmt w:val="decimal"/>
-      <w:lvlText w:val=""/>
-      <w:lvlJc w:val="left"/>
-    </w:lvl>
-    <w:lvl w:ilvl="2" w:tplc="05025DF2">
-      <w:numFmt w:val="decimal"/>
-      <w:lvlText w:val=""/>
-      <w:lvlJc w:val="left"/>
-    </w:lvl>
-    <w:lvl w:ilvl="3" w:tplc="64463D4A">
-      <w:numFmt w:val="decimal"/>
-      <w:lvlText w:val=""/>
-      <w:lvlJc w:val="left"/>
-    </w:lvl>
-    <w:lvl w:ilvl="4" w:tplc="A0A8F2AE">
-      <w:numFmt w:val="decimal"/>
-      <w:lvlText w:val=""/>
-      <w:lvlJc w:val="left"/>
-    </w:lvl>
-    <w:lvl w:ilvl="5" w:tplc="90AEDC8A">
-      <w:numFmt w:val="decimal"/>
-      <w:lvlText w:val=""/>
-      <w:lvlJc w:val="left"/>
-    </w:lvl>
-    <w:lvl w:ilvl="6" w:tplc="1B7A7248">
-      <w:numFmt w:val="decimal"/>
-      <w:lvlText w:val=""/>
-      <w:lvlJc w:val="left"/>
-    </w:lvl>
-    <w:lvl w:ilvl="7" w:tplc="BE78824E">
-      <w:numFmt w:val="decimal"/>
-      <w:lvlText w:val=""/>
-      <w:lvlJc w:val="left"/>
-    </w:lvl>
-    <w:lvl w:ilvl="8" w:tplc="4B16F2D0">
-      <w:numFmt w:val="decimal"/>
-      <w:lvlText w:val=""/>
-      <w:lvlJc w:val="left"/>
-    </w:lvl>
-  </w:abstractNum>
-  <w:abstractNum w:abstractNumId="5" w15:restartNumberingAfterBreak="0">
-    <w:nsid w:val="525C6339"/>
-    <w:multiLevelType w:val="hybridMultilevel"/>
-    <w:tmpl w:val="98FC87E8"/>
-    <w:lvl w:ilvl="0" w:tplc="5C6C2CAA">
-      <w:start w:val="1"/>
-      <w:numFmt w:val="decimal"/>
-      <w:lvlText w:val="%1."/>
-      <w:lvlJc w:val="left"/>
-      <w:pPr>
-        <w:ind w:left="720" w:hanging="360"/>
-      </w:pPr>
-    </w:lvl>
-    <w:lvl w:ilvl="1" w:tplc="01BE4928">
-      <w:numFmt w:val="decimal"/>
-      <w:lvlText w:val=""/>
-      <w:lvlJc w:val="left"/>
-    </w:lvl>
-    <w:lvl w:ilvl="2" w:tplc="063A21C8">
-      <w:numFmt w:val="decimal"/>
-      <w:lvlText w:val=""/>
-      <w:lvlJc w:val="left"/>
-    </w:lvl>
-    <w:lvl w:ilvl="3" w:tplc="7F74F78A">
-      <w:numFmt w:val="decimal"/>
-      <w:lvlText w:val=""/>
-      <w:lvlJc w:val="left"/>
-    </w:lvl>
-    <w:lvl w:ilvl="4" w:tplc="3484188A">
-      <w:numFmt w:val="decimal"/>
-      <w:lvlText w:val=""/>
-      <w:lvlJc w:val="left"/>
-    </w:lvl>
-    <w:lvl w:ilvl="5" w:tplc="AB22C874">
-      <w:numFmt w:val="decimal"/>
-      <w:lvlText w:val=""/>
-      <w:lvlJc w:val="left"/>
-    </w:lvl>
-    <w:lvl w:ilvl="6" w:tplc="C40203F2">
-      <w:numFmt w:val="decimal"/>
-      <w:lvlText w:val=""/>
-      <w:lvlJc w:val="left"/>
-    </w:lvl>
-    <w:lvl w:ilvl="7" w:tplc="C044AD10">
-      <w:numFmt w:val="decimal"/>
-      <w:lvlText w:val=""/>
-      <w:lvlJc w:val="left"/>
-    </w:lvl>
-    <w:lvl w:ilvl="8" w:tplc="B9CC573E">
-      <w:numFmt w:val="decimal"/>
-      <w:lvlText w:val=""/>
-      <w:lvlJc w:val="left"/>
-    </w:lvl>
-  </w:abstractNum>
-  <w:abstractNum w:abstractNumId="6" w15:restartNumberingAfterBreak="0">
-    <w:nsid w:val="57F475DA"/>
-    <w:multiLevelType w:val="hybridMultilevel"/>
-    <w:tmpl w:val="058654D6"/>
-    <w:lvl w:ilvl="0" w:tplc="ED929C54" w:tentative="1">
+    <w:tmpl w:val="371EC10A"/>
+    <w:lvl w:ilvl="0" w:tplc="29C254A8" w:tentative="1">
       <w:start w:val="1"/>
       <w:numFmt w:val="bullet"/>
       <w:lvlText w:val="●"/>
@@ -47943,7 +47782,7 @@
         <w:ind w:left="720" w:hanging="360"/>
       </w:pPr>
     </w:lvl>
-    <w:lvl w:ilvl="1" w:tplc="DA34B620" w:tentative="1">
+    <w:lvl w:ilvl="1" w:tplc="206E96BE" w:tentative="1">
       <w:start w:val="1"/>
       <w:numFmt w:val="bullet"/>
       <w:lvlText w:val="○"/>
@@ -47952,7 +47791,7 @@
         <w:ind w:left="1440" w:hanging="360"/>
       </w:pPr>
     </w:lvl>
-    <w:lvl w:ilvl="2" w:tplc="8008482E" w:tentative="1">
+    <w:lvl w:ilvl="2" w:tplc="8C7E4006" w:tentative="1">
       <w:start w:val="1"/>
       <w:numFmt w:val="bullet"/>
       <w:lvlText w:val="■"/>
@@ -47961,7 +47800,7 @@
         <w:ind w:left="2160" w:hanging="360"/>
       </w:pPr>
     </w:lvl>
-    <w:lvl w:ilvl="3" w:tplc="72F6A9F0" w:tentative="1">
+    <w:lvl w:ilvl="3" w:tplc="ACD4C5B6" w:tentative="1">
       <w:start w:val="1"/>
       <w:numFmt w:val="bullet"/>
       <w:lvlText w:val="●"/>
@@ -47970,7 +47809,7 @@
         <w:ind w:left="2880" w:hanging="360"/>
       </w:pPr>
     </w:lvl>
-    <w:lvl w:ilvl="4" w:tplc="0974FF22" w:tentative="1">
+    <w:lvl w:ilvl="4" w:tplc="56B83C60" w:tentative="1">
       <w:start w:val="1"/>
       <w:numFmt w:val="bullet"/>
       <w:lvlText w:val="○"/>
@@ -47979,7 +47818,7 @@
         <w:ind w:left="3600" w:hanging="360"/>
       </w:pPr>
     </w:lvl>
-    <w:lvl w:ilvl="5" w:tplc="50E00EFC" w:tentative="1">
+    <w:lvl w:ilvl="5" w:tplc="BB0A1F14" w:tentative="1">
       <w:start w:val="1"/>
       <w:numFmt w:val="bullet"/>
       <w:lvlText w:val="■"/>
@@ -47988,7 +47827,7 @@
         <w:ind w:left="4320" w:hanging="360"/>
       </w:pPr>
     </w:lvl>
-    <w:lvl w:ilvl="6" w:tplc="4D9AA4A8" w:tentative="1">
+    <w:lvl w:ilvl="6" w:tplc="BF084D64" w:tentative="1">
       <w:start w:val="1"/>
       <w:numFmt w:val="bullet"/>
       <w:lvlText w:val="●"/>
@@ -47997,7 +47836,7 @@
         <w:ind w:left="5040" w:hanging="360"/>
       </w:pPr>
     </w:lvl>
-    <w:lvl w:ilvl="7" w:tplc="4F4A5016" w:tentative="1">
+    <w:lvl w:ilvl="7" w:tplc="4DECE366" w:tentative="1">
       <w:start w:val="1"/>
       <w:numFmt w:val="bullet"/>
       <w:lvlText w:val="●"/>
@@ -48006,7 +47845,7 @@
         <w:ind w:left="5760" w:hanging="360"/>
       </w:pPr>
     </w:lvl>
-    <w:lvl w:ilvl="8" w:tplc="F62EEA72" w:tentative="1">
+    <w:lvl w:ilvl="8" w:tplc="6ADAC016" w:tentative="1">
       <w:start w:val="1"/>
       <w:numFmt w:val="bullet"/>
       <w:lvlText w:val="●"/>
@@ -48016,11 +47855,65 @@
       </w:pPr>
     </w:lvl>
   </w:abstractNum>
-  <w:abstractNum w:abstractNumId="7" w15:restartNumberingAfterBreak="0">
-    <w:nsid w:val="682D5D8A"/>
+  <w:abstractNum w:abstractNumId="4" w15:restartNumberingAfterBreak="0">
+    <w:nsid w:val="4CEC4F84"/>
     <w:multiLevelType w:val="hybridMultilevel"/>
-    <w:tmpl w:val="A40008D6"/>
-    <w:lvl w:ilvl="0" w:tplc="68B2EB52">
+    <w:tmpl w:val="6DD400DE"/>
+    <w:lvl w:ilvl="0" w:tplc="99E2171C">
+      <w:start w:val="1"/>
+      <w:numFmt w:val="decimal"/>
+      <w:lvlText w:val="%1."/>
+      <w:lvlJc w:val="left"/>
+      <w:pPr>
+        <w:ind w:left="720" w:hanging="360"/>
+      </w:pPr>
+    </w:lvl>
+    <w:lvl w:ilvl="1" w:tplc="ED64C108">
+      <w:numFmt w:val="decimal"/>
+      <w:lvlText w:val=""/>
+      <w:lvlJc w:val="left"/>
+    </w:lvl>
+    <w:lvl w:ilvl="2" w:tplc="E604C0F6">
+      <w:numFmt w:val="decimal"/>
+      <w:lvlText w:val=""/>
+      <w:lvlJc w:val="left"/>
+    </w:lvl>
+    <w:lvl w:ilvl="3" w:tplc="3C94811A">
+      <w:numFmt w:val="decimal"/>
+      <w:lvlText w:val=""/>
+      <w:lvlJc w:val="left"/>
+    </w:lvl>
+    <w:lvl w:ilvl="4" w:tplc="31A85A9E">
+      <w:numFmt w:val="decimal"/>
+      <w:lvlText w:val=""/>
+      <w:lvlJc w:val="left"/>
+    </w:lvl>
+    <w:lvl w:ilvl="5" w:tplc="D91C8A52">
+      <w:numFmt w:val="decimal"/>
+      <w:lvlText w:val=""/>
+      <w:lvlJc w:val="left"/>
+    </w:lvl>
+    <w:lvl w:ilvl="6" w:tplc="F782E2F8">
+      <w:numFmt w:val="decimal"/>
+      <w:lvlText w:val=""/>
+      <w:lvlJc w:val="left"/>
+    </w:lvl>
+    <w:lvl w:ilvl="7" w:tplc="DAF22688">
+      <w:numFmt w:val="decimal"/>
+      <w:lvlText w:val=""/>
+      <w:lvlJc w:val="left"/>
+    </w:lvl>
+    <w:lvl w:ilvl="8" w:tplc="BC465420">
+      <w:numFmt w:val="decimal"/>
+      <w:lvlText w:val=""/>
+      <w:lvlJc w:val="left"/>
+    </w:lvl>
+  </w:abstractNum>
+  <w:abstractNum w:abstractNumId="5" w15:restartNumberingAfterBreak="0">
+    <w:nsid w:val="4F6638E6"/>
+    <w:multiLevelType w:val="hybridMultilevel"/>
+    <w:tmpl w:val="264CB0D6"/>
+    <w:lvl w:ilvl="0" w:tplc="96C692C0">
       <w:start w:val="1"/>
       <w:numFmt w:val="bullet"/>
       <w:lvlText w:val="•"/>
@@ -48029,52 +47922,52 @@
         <w:ind w:left="720" w:hanging="360"/>
       </w:pPr>
     </w:lvl>
-    <w:lvl w:ilvl="1" w:tplc="292036C8">
+    <w:lvl w:ilvl="1" w:tplc="54B2ADEC">
       <w:numFmt w:val="decimal"/>
       <w:lvlText w:val=""/>
       <w:lvlJc w:val="left"/>
     </w:lvl>
-    <w:lvl w:ilvl="2" w:tplc="1BC60274">
+    <w:lvl w:ilvl="2" w:tplc="C478C796">
       <w:numFmt w:val="decimal"/>
       <w:lvlText w:val=""/>
       <w:lvlJc w:val="left"/>
     </w:lvl>
-    <w:lvl w:ilvl="3" w:tplc="60C86BC6">
+    <w:lvl w:ilvl="3" w:tplc="72360260">
       <w:numFmt w:val="decimal"/>
       <w:lvlText w:val=""/>
       <w:lvlJc w:val="left"/>
     </w:lvl>
-    <w:lvl w:ilvl="4" w:tplc="2626EA48">
+    <w:lvl w:ilvl="4" w:tplc="7AFC79CC">
       <w:numFmt w:val="decimal"/>
       <w:lvlText w:val=""/>
       <w:lvlJc w:val="left"/>
     </w:lvl>
-    <w:lvl w:ilvl="5" w:tplc="8D765A18">
+    <w:lvl w:ilvl="5" w:tplc="008A2C3E">
       <w:numFmt w:val="decimal"/>
       <w:lvlText w:val=""/>
       <w:lvlJc w:val="left"/>
     </w:lvl>
-    <w:lvl w:ilvl="6" w:tplc="CBB0D50C">
+    <w:lvl w:ilvl="6" w:tplc="D22EDCD2">
       <w:numFmt w:val="decimal"/>
       <w:lvlText w:val=""/>
       <w:lvlJc w:val="left"/>
     </w:lvl>
-    <w:lvl w:ilvl="7" w:tplc="BB4E1E96">
+    <w:lvl w:ilvl="7" w:tplc="EE5CCB26">
       <w:numFmt w:val="decimal"/>
       <w:lvlText w:val=""/>
       <w:lvlJc w:val="left"/>
     </w:lvl>
-    <w:lvl w:ilvl="8" w:tplc="A9D85486">
+    <w:lvl w:ilvl="8" w:tplc="E564C710">
       <w:numFmt w:val="decimal"/>
       <w:lvlText w:val=""/>
       <w:lvlJc w:val="left"/>
     </w:lvl>
   </w:abstractNum>
-  <w:abstractNum w:abstractNumId="8" w15:restartNumberingAfterBreak="0">
-    <w:nsid w:val="6AA80306"/>
+  <w:abstractNum w:abstractNumId="6" w15:restartNumberingAfterBreak="0">
+    <w:nsid w:val="54FE6609"/>
     <w:multiLevelType w:val="hybridMultilevel"/>
-    <w:tmpl w:val="548848FA"/>
-    <w:lvl w:ilvl="0" w:tplc="F51CBAA8">
+    <w:tmpl w:val="51D2784E"/>
+    <w:lvl w:ilvl="0" w:tplc="D7CC66CC">
       <w:start w:val="1"/>
       <w:numFmt w:val="decimal"/>
       <w:lvlText w:val="%1."/>
@@ -48083,97 +47976,205 @@
         <w:ind w:left="720" w:hanging="360"/>
       </w:pPr>
     </w:lvl>
-    <w:lvl w:ilvl="1" w:tplc="32FEAC14">
+    <w:lvl w:ilvl="1" w:tplc="33ACB90A">
       <w:numFmt w:val="decimal"/>
       <w:lvlText w:val=""/>
       <w:lvlJc w:val="left"/>
     </w:lvl>
-    <w:lvl w:ilvl="2" w:tplc="2B42C7A0">
+    <w:lvl w:ilvl="2" w:tplc="50A40E44">
       <w:numFmt w:val="decimal"/>
       <w:lvlText w:val=""/>
       <w:lvlJc w:val="left"/>
     </w:lvl>
-    <w:lvl w:ilvl="3" w:tplc="B91AC6E2">
+    <w:lvl w:ilvl="3" w:tplc="93965508">
       <w:numFmt w:val="decimal"/>
       <w:lvlText w:val=""/>
       <w:lvlJc w:val="left"/>
     </w:lvl>
-    <w:lvl w:ilvl="4" w:tplc="674E7C96">
+    <w:lvl w:ilvl="4" w:tplc="81E25162">
       <w:numFmt w:val="decimal"/>
       <w:lvlText w:val=""/>
       <w:lvlJc w:val="left"/>
     </w:lvl>
-    <w:lvl w:ilvl="5" w:tplc="E5C44414">
+    <w:lvl w:ilvl="5" w:tplc="6FE8A1F6">
       <w:numFmt w:val="decimal"/>
       <w:lvlText w:val=""/>
       <w:lvlJc w:val="left"/>
     </w:lvl>
-    <w:lvl w:ilvl="6" w:tplc="12A8011C">
+    <w:lvl w:ilvl="6" w:tplc="D88E41B4">
       <w:numFmt w:val="decimal"/>
       <w:lvlText w:val=""/>
       <w:lvlJc w:val="left"/>
     </w:lvl>
-    <w:lvl w:ilvl="7" w:tplc="00FAAED2">
+    <w:lvl w:ilvl="7" w:tplc="11148988">
       <w:numFmt w:val="decimal"/>
       <w:lvlText w:val=""/>
       <w:lvlJc w:val="left"/>
     </w:lvl>
-    <w:lvl w:ilvl="8" w:tplc="1EFE6990">
+    <w:lvl w:ilvl="8" w:tplc="93A81D32">
+      <w:numFmt w:val="decimal"/>
+      <w:lvlText w:val=""/>
+      <w:lvlJc w:val="left"/>
+    </w:lvl>
+  </w:abstractNum>
+  <w:abstractNum w:abstractNumId="7" w15:restartNumberingAfterBreak="0">
+    <w:nsid w:val="65BC1F4A"/>
+    <w:multiLevelType w:val="hybridMultilevel"/>
+    <w:tmpl w:val="14EE5A04"/>
+    <w:lvl w:ilvl="0" w:tplc="C2B2B406">
+      <w:start w:val="1"/>
+      <w:numFmt w:val="decimal"/>
+      <w:lvlText w:val="%1."/>
+      <w:lvlJc w:val="left"/>
+      <w:pPr>
+        <w:ind w:left="720" w:hanging="360"/>
+      </w:pPr>
+    </w:lvl>
+    <w:lvl w:ilvl="1" w:tplc="DA7E921E">
+      <w:numFmt w:val="decimal"/>
+      <w:lvlText w:val=""/>
+      <w:lvlJc w:val="left"/>
+    </w:lvl>
+    <w:lvl w:ilvl="2" w:tplc="35821270">
+      <w:numFmt w:val="decimal"/>
+      <w:lvlText w:val=""/>
+      <w:lvlJc w:val="left"/>
+    </w:lvl>
+    <w:lvl w:ilvl="3" w:tplc="B07E41B6">
+      <w:numFmt w:val="decimal"/>
+      <w:lvlText w:val=""/>
+      <w:lvlJc w:val="left"/>
+    </w:lvl>
+    <w:lvl w:ilvl="4" w:tplc="56DCD05A">
+      <w:numFmt w:val="decimal"/>
+      <w:lvlText w:val=""/>
+      <w:lvlJc w:val="left"/>
+    </w:lvl>
+    <w:lvl w:ilvl="5" w:tplc="8FBA5756">
+      <w:numFmt w:val="decimal"/>
+      <w:lvlText w:val=""/>
+      <w:lvlJc w:val="left"/>
+    </w:lvl>
+    <w:lvl w:ilvl="6" w:tplc="D832701E">
+      <w:numFmt w:val="decimal"/>
+      <w:lvlText w:val=""/>
+      <w:lvlJc w:val="left"/>
+    </w:lvl>
+    <w:lvl w:ilvl="7" w:tplc="9E129658">
+      <w:numFmt w:val="decimal"/>
+      <w:lvlText w:val=""/>
+      <w:lvlJc w:val="left"/>
+    </w:lvl>
+    <w:lvl w:ilvl="8" w:tplc="1268A366">
+      <w:numFmt w:val="decimal"/>
+      <w:lvlText w:val=""/>
+      <w:lvlJc w:val="left"/>
+    </w:lvl>
+  </w:abstractNum>
+  <w:abstractNum w:abstractNumId="8" w15:restartNumberingAfterBreak="0">
+    <w:nsid w:val="777E6CE7"/>
+    <w:multiLevelType w:val="hybridMultilevel"/>
+    <w:tmpl w:val="76B2FA1E"/>
+    <w:lvl w:ilvl="0" w:tplc="D8B8C6A6">
+      <w:start w:val="1"/>
+      <w:numFmt w:val="decimal"/>
+      <w:lvlText w:val="%1."/>
+      <w:lvlJc w:val="left"/>
+      <w:pPr>
+        <w:ind w:left="720" w:hanging="360"/>
+      </w:pPr>
+    </w:lvl>
+    <w:lvl w:ilvl="1" w:tplc="434ACB76">
+      <w:numFmt w:val="decimal"/>
+      <w:lvlText w:val=""/>
+      <w:lvlJc w:val="left"/>
+    </w:lvl>
+    <w:lvl w:ilvl="2" w:tplc="2580F1F4">
+      <w:numFmt w:val="decimal"/>
+      <w:lvlText w:val=""/>
+      <w:lvlJc w:val="left"/>
+    </w:lvl>
+    <w:lvl w:ilvl="3" w:tplc="B18A6A10">
+      <w:numFmt w:val="decimal"/>
+      <w:lvlText w:val=""/>
+      <w:lvlJc w:val="left"/>
+    </w:lvl>
+    <w:lvl w:ilvl="4" w:tplc="6D50EDAA">
+      <w:numFmt w:val="decimal"/>
+      <w:lvlText w:val=""/>
+      <w:lvlJc w:val="left"/>
+    </w:lvl>
+    <w:lvl w:ilvl="5" w:tplc="4ACCED18">
+      <w:numFmt w:val="decimal"/>
+      <w:lvlText w:val=""/>
+      <w:lvlJc w:val="left"/>
+    </w:lvl>
+    <w:lvl w:ilvl="6" w:tplc="461C35D8">
+      <w:numFmt w:val="decimal"/>
+      <w:lvlText w:val=""/>
+      <w:lvlJc w:val="left"/>
+    </w:lvl>
+    <w:lvl w:ilvl="7" w:tplc="2634DE32">
+      <w:numFmt w:val="decimal"/>
+      <w:lvlText w:val=""/>
+      <w:lvlJc w:val="left"/>
+    </w:lvl>
+    <w:lvl w:ilvl="8" w:tplc="C5840EA8">
       <w:numFmt w:val="decimal"/>
       <w:lvlText w:val=""/>
       <w:lvlJc w:val="left"/>
     </w:lvl>
   </w:abstractNum>
   <w:num w:numId="1">
+    <w:abstractNumId w:val="3"/>
+    <w:lvlOverride w:ilvl="0">
+      <w:startOverride w:val="1"/>
+    </w:lvlOverride>
+  </w:num>
+  <w:num w:numId="2">
+    <w:abstractNumId w:val="1"/>
+    <w:lvlOverride w:ilvl="0">
+      <w:startOverride w:val="1"/>
+    </w:lvlOverride>
+  </w:num>
+  <w:num w:numId="3">
+    <w:abstractNumId w:val="7"/>
+    <w:lvlOverride w:ilvl="0">
+      <w:startOverride w:val="1"/>
+    </w:lvlOverride>
+  </w:num>
+  <w:num w:numId="4">
+    <w:abstractNumId w:val="8"/>
+    <w:lvlOverride w:ilvl="0">
+      <w:startOverride w:val="1"/>
+    </w:lvlOverride>
+  </w:num>
+  <w:num w:numId="5">
+    <w:abstractNumId w:val="5"/>
+    <w:lvlOverride w:ilvl="0">
+      <w:startOverride w:val="1"/>
+    </w:lvlOverride>
+  </w:num>
+  <w:num w:numId="6">
+    <w:abstractNumId w:val="2"/>
+    <w:lvlOverride w:ilvl="0">
+      <w:startOverride w:val="1"/>
+    </w:lvlOverride>
+  </w:num>
+  <w:num w:numId="7">
     <w:abstractNumId w:val="6"/>
     <w:lvlOverride w:ilvl="0">
       <w:startOverride w:val="1"/>
     </w:lvlOverride>
   </w:num>
-  <w:num w:numId="2">
+  <w:num w:numId="8">
     <w:abstractNumId w:val="0"/>
     <w:lvlOverride w:ilvl="0">
       <w:startOverride w:val="1"/>
     </w:lvlOverride>
   </w:num>
-  <w:num w:numId="3">
+  <w:num w:numId="9">
     <w:abstractNumId w:val="4"/>
-    <w:lvlOverride w:ilvl="0">
-      <w:startOverride w:val="1"/>
-    </w:lvlOverride>
-  </w:num>
-  <w:num w:numId="4">
-    <w:abstractNumId w:val="5"/>
-    <w:lvlOverride w:ilvl="0">
-      <w:startOverride w:val="1"/>
-    </w:lvlOverride>
-  </w:num>
-  <w:num w:numId="5">
-    <w:abstractNumId w:val="7"/>
-    <w:lvlOverride w:ilvl="0">
-      <w:startOverride w:val="1"/>
-    </w:lvlOverride>
-  </w:num>
-  <w:num w:numId="6">
-    <w:abstractNumId w:val="3"/>
-    <w:lvlOverride w:ilvl="0">
-      <w:startOverride w:val="1"/>
-    </w:lvlOverride>
-  </w:num>
-  <w:num w:numId="7">
-    <w:abstractNumId w:val="1"/>
-    <w:lvlOverride w:ilvl="0">
-      <w:startOverride w:val="1"/>
-    </w:lvlOverride>
-  </w:num>
-  <w:num w:numId="8">
-    <w:abstractNumId w:val="8"/>
-    <w:lvlOverride w:ilvl="0">
-      <w:startOverride w:val="1"/>
-    </w:lvlOverride>
-  </w:num>
-  <w:num w:numId="9">
-    <w:abstractNumId w:val="2"/>
     <w:lvlOverride w:ilvl="0">
       <w:startOverride w:val="1"/>
     </w:lvlOverride>
@@ -48806,7 +48807,7 @@
     <w:autoRedefine/>
     <w:uiPriority w:val="39"/>
     <w:unhideWhenUsed/>
-    <w:rsid w:val="00DD2102"/>
+    <w:rsid w:val="00643691"/>
     <w:pPr>
       <w:spacing w:after="100"/>
     </w:pPr>
@@ -48818,7 +48819,7 @@
     <w:autoRedefine/>
     <w:uiPriority w:val="39"/>
     <w:unhideWhenUsed/>
-    <w:rsid w:val="00DD2102"/>
+    <w:rsid w:val="00643691"/>
     <w:pPr>
       <w:spacing w:after="100"/>
       <w:ind w:left="240"/>
@@ -48831,7 +48832,7 @@
     <w:autoRedefine/>
     <w:uiPriority w:val="39"/>
     <w:unhideWhenUsed/>
-    <w:rsid w:val="00DD2102"/>
+    <w:rsid w:val="00643691"/>
     <w:pPr>
       <w:spacing w:after="100"/>
       <w:ind w:left="480"/>
@@ -48844,7 +48845,7 @@
     <w:autoRedefine/>
     <w:uiPriority w:val="39"/>
     <w:unhideWhenUsed/>
-    <w:rsid w:val="00DD2102"/>
+    <w:rsid w:val="00643691"/>
     <w:pPr>
       <w:spacing w:after="100" w:line="259" w:lineRule="auto"/>
       <w:ind w:left="660"/>
@@ -48862,7 +48863,7 @@
     <w:autoRedefine/>
     <w:uiPriority w:val="39"/>
     <w:unhideWhenUsed/>
-    <w:rsid w:val="00DD2102"/>
+    <w:rsid w:val="00643691"/>
     <w:pPr>
       <w:spacing w:after="100" w:line="259" w:lineRule="auto"/>
       <w:ind w:left="880"/>
@@ -48880,7 +48881,7 @@
     <w:autoRedefine/>
     <w:uiPriority w:val="39"/>
     <w:unhideWhenUsed/>
-    <w:rsid w:val="00DD2102"/>
+    <w:rsid w:val="00643691"/>
     <w:pPr>
       <w:spacing w:after="100" w:line="259" w:lineRule="auto"/>
       <w:ind w:left="1100"/>
@@ -48898,7 +48899,7 @@
     <w:autoRedefine/>
     <w:uiPriority w:val="39"/>
     <w:unhideWhenUsed/>
-    <w:rsid w:val="00DD2102"/>
+    <w:rsid w:val="00643691"/>
     <w:pPr>
       <w:spacing w:after="100" w:line="259" w:lineRule="auto"/>
       <w:ind w:left="1320"/>
@@ -48916,7 +48917,7 @@
     <w:autoRedefine/>
     <w:uiPriority w:val="39"/>
     <w:unhideWhenUsed/>
-    <w:rsid w:val="00DD2102"/>
+    <w:rsid w:val="00643691"/>
     <w:pPr>
       <w:spacing w:after="100" w:line="259" w:lineRule="auto"/>
       <w:ind w:left="1540"/>
@@ -48934,7 +48935,7 @@
     <w:autoRedefine/>
     <w:uiPriority w:val="39"/>
     <w:unhideWhenUsed/>
-    <w:rsid w:val="00DD2102"/>
+    <w:rsid w:val="00643691"/>
     <w:pPr>
       <w:spacing w:after="100" w:line="259" w:lineRule="auto"/>
       <w:ind w:left="1760"/>

</xml_diff>